<commit_message>
Fix Task3 formula in lab report and code (variant 22)
Replace incorrect (a+b)^2 with the assigned expression
((a-b)^3 - a^3) / (3ab^2 - b^3 - 3a^2b), which is analytically
identically 1 but demonstrates catastrophic cancellation in float.
Update report text (problem statement, output description,
algorithm, conclusion) to match.

Co-Authored-By: Claude Sonnet 5 <noreply@anthropic.com>
</commit_message>
<xml_diff>
--- a/1 Lab/Отчет.docx
+++ b/1 Lab/Отчет.docx
@@ -793,18 +793,8 @@
           <w:szCs w:val="26"/>
           <w:lang w:val="ru-RU"/>
         </w:rPr>
-        <w:t xml:space="preserve">) · </w:t>
-      </w:r>
-      <w:proofErr w:type="gramStart"/>
-      <w:r>
-        <w:rPr>
-          <w:sz w:val="26"/>
-          <w:szCs w:val="26"/>
-          <w:lang w:val="ru-RU"/>
-        </w:rPr>
-        <w:t>√(</w:t>
-      </w:r>
-      <w:proofErr w:type="gramEnd"/>
+        <w:t xml:space="preserve">) · √(</w:t>
+      </w:r>
       <w:r>
         <w:rPr>
           <w:sz w:val="26"/>
@@ -895,85 +885,12 @@
         </w:rPr>
         <w:t xml:space="preserve">1. Проверить принадлежность точки заштрихованной области (рисунок 1) — выпуклому четырёхугольнику с вершинами (–7; 0), (0; 5), (3; 0), (0; –5). </w:t>
       </w:r>
-      <w:proofErr w:type="spellStart"/>
-      <w:r>
-        <w:rPr>
-          <w:sz w:val="26"/>
-          <w:szCs w:val="26"/>
-        </w:rPr>
-        <w:t>Границы</w:t>
-      </w:r>
-      <w:proofErr w:type="spellEnd"/>
-      <w:r>
-        <w:rPr>
-          <w:sz w:val="26"/>
-          <w:szCs w:val="26"/>
-        </w:rPr>
-        <w:t xml:space="preserve"> </w:t>
-      </w:r>
-      <w:proofErr w:type="spellStart"/>
-      <w:r>
-        <w:rPr>
-          <w:sz w:val="26"/>
-          <w:szCs w:val="26"/>
-        </w:rPr>
-        <w:t>фигуры</w:t>
-      </w:r>
-      <w:proofErr w:type="spellEnd"/>
-      <w:r>
-        <w:rPr>
-          <w:sz w:val="26"/>
-          <w:szCs w:val="26"/>
-        </w:rPr>
-        <w:t xml:space="preserve"> </w:t>
-      </w:r>
-      <w:proofErr w:type="spellStart"/>
-      <w:r>
-        <w:rPr>
-          <w:sz w:val="26"/>
-          <w:szCs w:val="26"/>
-        </w:rPr>
-        <w:t>считаются</w:t>
-      </w:r>
-      <w:proofErr w:type="spellEnd"/>
-      <w:r>
-        <w:rPr>
-          <w:sz w:val="26"/>
-          <w:szCs w:val="26"/>
-        </w:rPr>
-        <w:t xml:space="preserve"> </w:t>
-      </w:r>
-      <w:proofErr w:type="spellStart"/>
-      <w:r>
-        <w:rPr>
-          <w:sz w:val="26"/>
-          <w:szCs w:val="26"/>
-        </w:rPr>
-        <w:t>частью</w:t>
-      </w:r>
-      <w:proofErr w:type="spellEnd"/>
-      <w:r>
-        <w:rPr>
-          <w:sz w:val="26"/>
-          <w:szCs w:val="26"/>
-        </w:rPr>
-        <w:t xml:space="preserve"> </w:t>
-      </w:r>
-      <w:proofErr w:type="spellStart"/>
-      <w:r>
-        <w:rPr>
-          <w:sz w:val="26"/>
-          <w:szCs w:val="26"/>
-        </w:rPr>
-        <w:t>области</w:t>
-      </w:r>
-      <w:proofErr w:type="spellEnd"/>
-      <w:r>
-        <w:rPr>
-          <w:sz w:val="26"/>
-          <w:szCs w:val="26"/>
-        </w:rPr>
-        <w:t>.</w:t>
+      <w:r>
+        <w:rPr>
+          <w:sz w:val="26"/>
+          <w:szCs w:val="26"/>
+        </w:rPr>
+        <w:t xml:space="preserve">Границы фигуры считаются частью области.</w:t>
       </w:r>
     </w:p>
     <w:p>
@@ -1042,23 +959,7 @@
           <w:iCs/>
           <w:lang w:val="ru-RU"/>
         </w:rPr>
-        <w:t xml:space="preserve">Рисунок </w:t>
-      </w:r>
-      <w:r>
-        <w:rPr>
-          <w:i/>
-          <w:iCs/>
-          <w:lang w:val="ru-RU"/>
-        </w:rPr>
-        <w:t xml:space="preserve">1 </w:t>
-      </w:r>
-      <w:r>
-        <w:rPr>
-          <w:i/>
-          <w:iCs/>
-          <w:lang w:val="ru-RU"/>
-        </w:rPr>
-        <w:t>— заштрихованная область варианта 22</w:t>
+        <w:t xml:space="preserve">Рисунок 1 — заштрихованная область варианта 22</w:t>
       </w:r>
     </w:p>
     <w:p>
@@ -1112,56 +1013,9 @@
         <w:rPr>
           <w:sz w:val="26"/>
           <w:szCs w:val="26"/>
-        </w:rPr>
-        <w:t>c</w:t>
-      </w:r>
-      <w:r>
-        <w:rPr>
-          <w:sz w:val="26"/>
-          <w:szCs w:val="26"/>
-          <w:lang w:val="ru-RU"/>
-        </w:rPr>
-        <w:t xml:space="preserve"> = (</w:t>
-      </w:r>
-      <w:r>
-        <w:rPr>
-          <w:sz w:val="26"/>
-          <w:szCs w:val="26"/>
-        </w:rPr>
-        <w:t>a</w:t>
-      </w:r>
-      <w:r>
-        <w:rPr>
-          <w:sz w:val="26"/>
-          <w:szCs w:val="26"/>
-          <w:lang w:val="ru-RU"/>
-        </w:rPr>
-        <w:t xml:space="preserve"> + </w:t>
-      </w:r>
-      <w:proofErr w:type="gramStart"/>
-      <w:r>
-        <w:rPr>
-          <w:sz w:val="26"/>
-          <w:szCs w:val="26"/>
-        </w:rPr>
-        <w:t>b</w:t>
-      </w:r>
-      <w:r>
-        <w:rPr>
-          <w:sz w:val="26"/>
-          <w:szCs w:val="26"/>
-          <w:lang w:val="ru-RU"/>
-        </w:rPr>
-        <w:t>)²</w:t>
-      </w:r>
-      <w:proofErr w:type="gramEnd"/>
-      <w:r>
-        <w:rPr>
-          <w:sz w:val="26"/>
-          <w:szCs w:val="26"/>
-          <w:lang w:val="ru-RU"/>
-        </w:rPr>
-        <w:t xml:space="preserve">, используя типы </w:t>
+          <w:lang w:val="ru-RU"/>
+        </w:rPr>
+        <w:t xml:space="preserve">c = ((a − b)³ − a³) / (3ab² − b³ − 3a²b), используя типы </w:t>
       </w:r>
       <w:r>
         <w:rPr>
@@ -1519,118 +1373,205 @@
         </w:rPr>
         <w:t xml:space="preserve">3 (тип </w:t>
       </w:r>
-      <w:proofErr w:type="spellStart"/>
       <w:r>
         <w:rPr>
           <w:sz w:val="26"/>
           <w:szCs w:val="26"/>
           <w:lang w:val="nl-NL"/>
         </w:rPr>
-        <w:t>bool</w:t>
-      </w:r>
-      <w:proofErr w:type="spellEnd"/>
+        <w:t xml:space="preserve">bool) </w:t>
+      </w:r>
+      <w:r>
+        <w:rPr>
+          <w:sz w:val="26"/>
+          <w:szCs w:val="26"/>
+          <w:lang w:val="ru-RU"/>
+        </w:rPr>
+        <w:t xml:space="preserve">— значения </w:t>
+      </w:r>
+      <w:r>
+        <w:rPr>
+          <w:sz w:val="26"/>
+          <w:szCs w:val="26"/>
+        </w:rPr>
+        <w:t>n</w:t>
+      </w:r>
+      <w:r>
+        <w:rPr>
+          <w:sz w:val="26"/>
+          <w:szCs w:val="26"/>
+          <w:lang w:val="ru-RU"/>
+        </w:rPr>
+        <w:t>++&lt;</w:t>
+      </w:r>
+      <w:r>
+        <w:rPr>
+          <w:sz w:val="26"/>
+          <w:szCs w:val="26"/>
+        </w:rPr>
+        <w:t>m</w:t>
+      </w:r>
+      <w:r>
+        <w:rPr>
+          <w:sz w:val="26"/>
+          <w:szCs w:val="26"/>
+          <w:lang w:val="ru-RU"/>
+        </w:rPr>
+        <w:t xml:space="preserve"> и --</w:t>
+      </w:r>
+      <w:r>
+        <w:rPr>
+          <w:sz w:val="26"/>
+          <w:szCs w:val="26"/>
+        </w:rPr>
+        <w:t>m</w:t>
+      </w:r>
+      <w:r>
+        <w:rPr>
+          <w:sz w:val="26"/>
+          <w:szCs w:val="26"/>
+          <w:lang w:val="ru-RU"/>
+        </w:rPr>
+        <w:t>&gt;</w:t>
+      </w:r>
+      <w:r>
+        <w:rPr>
+          <w:sz w:val="26"/>
+          <w:szCs w:val="26"/>
+        </w:rPr>
+        <w:t>n</w:t>
+      </w:r>
+      <w:r>
+        <w:rPr>
+          <w:sz w:val="26"/>
+          <w:szCs w:val="26"/>
+          <w:lang w:val="ru-RU"/>
+        </w:rPr>
+        <w:t xml:space="preserve">; </w:t>
+      </w:r>
+      <w:r>
+        <w:rPr>
+          <w:sz w:val="26"/>
+          <w:szCs w:val="26"/>
+        </w:rPr>
+        <w:t>result</w:t>
+      </w:r>
+      <w:r>
+        <w:rPr>
+          <w:sz w:val="26"/>
+          <w:szCs w:val="26"/>
+          <w:lang w:val="ru-RU"/>
+        </w:rPr>
+        <w:t xml:space="preserve">4 (тип </w:t>
+      </w:r>
+      <w:r>
+        <w:rPr>
+          <w:sz w:val="26"/>
+          <w:szCs w:val="26"/>
+          <w:lang w:val="fr-FR"/>
+        </w:rPr>
+        <w:t xml:space="preserve">double) </w:t>
+      </w:r>
+      <w:r>
+        <w:rPr>
+          <w:sz w:val="26"/>
+          <w:szCs w:val="26"/>
+          <w:lang w:val="ru-RU"/>
+        </w:rPr>
+        <w:t>— значение выражения 2^(–</w:t>
+      </w:r>
+      <w:r>
+        <w:rPr>
+          <w:sz w:val="26"/>
+          <w:szCs w:val="26"/>
+        </w:rPr>
+        <w:t>x</w:t>
+      </w:r>
+      <w:r>
+        <w:rPr>
+          <w:sz w:val="26"/>
+          <w:szCs w:val="26"/>
+          <w:lang w:val="ru-RU"/>
+        </w:rPr>
+        <w:t>)·√(</w:t>
+      </w:r>
+      <w:r>
+        <w:rPr>
+          <w:sz w:val="26"/>
+          <w:szCs w:val="26"/>
+        </w:rPr>
+        <w:t>x</w:t>
+      </w:r>
+      <w:r>
+        <w:rPr>
+          <w:sz w:val="26"/>
+          <w:szCs w:val="26"/>
+          <w:lang w:val="ru-RU"/>
+        </w:rPr>
+        <w:t>+4)·√|</w:t>
+      </w:r>
+      <w:r>
+        <w:rPr>
+          <w:sz w:val="26"/>
+          <w:szCs w:val="26"/>
+        </w:rPr>
+        <w:t>x</w:t>
+      </w:r>
+      <w:r>
+        <w:rPr>
+          <w:sz w:val="26"/>
+          <w:szCs w:val="26"/>
+          <w:lang w:val="ru-RU"/>
+        </w:rPr>
+        <w:t xml:space="preserve">|, либо сообщение об ошибке, если </w:t>
+      </w:r>
+      <w:r>
+        <w:rPr>
+          <w:sz w:val="26"/>
+          <w:szCs w:val="26"/>
+          <w:lang w:val="fr-FR"/>
+        </w:rPr>
+        <w:t xml:space="preserve">x &lt; </w:t>
+      </w:r>
+      <w:r>
+        <w:rPr>
+          <w:sz w:val="26"/>
+          <w:szCs w:val="26"/>
+          <w:lang w:val="ru-RU"/>
+        </w:rPr>
+        <w:t xml:space="preserve">–4. Для задачи </w:t>
+      </w:r>
+      <w:r>
+        <w:rPr>
+          <w:sz w:val="26"/>
+          <w:szCs w:val="26"/>
+          <w:lang w:val="it-IT"/>
+        </w:rPr>
+        <w:t>2: inside (</w:t>
+      </w:r>
+      <w:r>
+        <w:rPr>
+          <w:sz w:val="26"/>
+          <w:szCs w:val="26"/>
+          <w:lang w:val="ru-RU"/>
+        </w:rPr>
+        <w:t xml:space="preserve">тип </w:t>
+      </w:r>
       <w:r>
         <w:rPr>
           <w:sz w:val="26"/>
           <w:szCs w:val="26"/>
           <w:lang w:val="nl-NL"/>
         </w:rPr>
-        <w:t xml:space="preserve">) </w:t>
-      </w:r>
-      <w:r>
-        <w:rPr>
-          <w:sz w:val="26"/>
-          <w:szCs w:val="26"/>
-          <w:lang w:val="ru-RU"/>
-        </w:rPr>
-        <w:t xml:space="preserve">— значения </w:t>
-      </w:r>
-      <w:r>
-        <w:rPr>
-          <w:sz w:val="26"/>
-          <w:szCs w:val="26"/>
-        </w:rPr>
-        <w:t>n</w:t>
-      </w:r>
-      <w:r>
-        <w:rPr>
-          <w:sz w:val="26"/>
-          <w:szCs w:val="26"/>
-          <w:lang w:val="ru-RU"/>
-        </w:rPr>
-        <w:t>+</w:t>
-      </w:r>
-      <w:proofErr w:type="gramStart"/>
-      <w:r>
-        <w:rPr>
-          <w:sz w:val="26"/>
-          <w:szCs w:val="26"/>
-          <w:lang w:val="ru-RU"/>
-        </w:rPr>
-        <w:t>+&lt;</w:t>
-      </w:r>
-      <w:proofErr w:type="gramEnd"/>
-      <w:r>
-        <w:rPr>
-          <w:sz w:val="26"/>
-          <w:szCs w:val="26"/>
-        </w:rPr>
-        <w:t>m</w:t>
-      </w:r>
-      <w:r>
-        <w:rPr>
-          <w:sz w:val="26"/>
-          <w:szCs w:val="26"/>
-          <w:lang w:val="ru-RU"/>
-        </w:rPr>
-        <w:t xml:space="preserve"> и --</w:t>
-      </w:r>
-      <w:proofErr w:type="gramStart"/>
-      <w:r>
-        <w:rPr>
-          <w:sz w:val="26"/>
-          <w:szCs w:val="26"/>
-        </w:rPr>
-        <w:t>m</w:t>
-      </w:r>
-      <w:r>
-        <w:rPr>
-          <w:sz w:val="26"/>
-          <w:szCs w:val="26"/>
-          <w:lang w:val="ru-RU"/>
-        </w:rPr>
-        <w:t>&gt;</w:t>
-      </w:r>
-      <w:r>
-        <w:rPr>
-          <w:sz w:val="26"/>
-          <w:szCs w:val="26"/>
-        </w:rPr>
-        <w:t>n</w:t>
-      </w:r>
-      <w:proofErr w:type="gramEnd"/>
-      <w:r>
-        <w:rPr>
-          <w:sz w:val="26"/>
-          <w:szCs w:val="26"/>
-          <w:lang w:val="ru-RU"/>
-        </w:rPr>
-        <w:t xml:space="preserve">; </w:t>
-      </w:r>
-      <w:r>
-        <w:rPr>
-          <w:sz w:val="26"/>
-          <w:szCs w:val="26"/>
-        </w:rPr>
-        <w:t>result</w:t>
-      </w:r>
-      <w:r>
-        <w:rPr>
-          <w:sz w:val="26"/>
-          <w:szCs w:val="26"/>
-          <w:lang w:val="ru-RU"/>
-        </w:rPr>
-        <w:t xml:space="preserve">4 (тип </w:t>
+        <w:t xml:space="preserve">bool) </w:t>
+      </w:r>
+      <w:r>
+        <w:rPr>
+          <w:sz w:val="26"/>
+          <w:szCs w:val="26"/>
+          <w:lang w:val="ru-RU"/>
+        </w:rPr>
+        <w:t xml:space="preserve">— </w:t>
       </w:r>
       <w:r>
         <w:rPr>
@@ -1638,6 +1579,82 @@
           <w:szCs w:val="26"/>
           <w:lang w:val="fr-FR"/>
         </w:rPr>
+        <w:t xml:space="preserve">true, </w:t>
+      </w:r>
+      <w:r>
+        <w:rPr>
+          <w:sz w:val="26"/>
+          <w:szCs w:val="26"/>
+          <w:lang w:val="ru-RU"/>
+        </w:rPr>
+        <w:t xml:space="preserve">если точка принадлежит области, иначе </w:t>
+      </w:r>
+      <w:r>
+        <w:rPr>
+          <w:sz w:val="26"/>
+          <w:szCs w:val="26"/>
+        </w:rPr>
+        <w:t>false</w:t>
+      </w:r>
+      <w:r>
+        <w:rPr>
+          <w:sz w:val="26"/>
+          <w:szCs w:val="26"/>
+          <w:lang w:val="ru-RU"/>
+        </w:rPr>
+        <w:t xml:space="preserve">. Для задачи 3: </w:t>
+      </w:r>
+      <w:r>
+        <w:rPr>
+          <w:sz w:val="26"/>
+          <w:szCs w:val="26"/>
+        </w:rPr>
+        <w:t>cFloat</w:t>
+      </w:r>
+      <w:r>
+        <w:rPr>
+          <w:sz w:val="26"/>
+          <w:szCs w:val="26"/>
+          <w:lang w:val="ru-RU"/>
+        </w:rPr>
+        <w:t xml:space="preserve"> (тип </w:t>
+      </w:r>
+      <w:r>
+        <w:rPr>
+          <w:sz w:val="26"/>
+          <w:szCs w:val="26"/>
+        </w:rPr>
+        <w:t>float</w:t>
+      </w:r>
+      <w:r>
+        <w:rPr>
+          <w:sz w:val="26"/>
+          <w:szCs w:val="26"/>
+          <w:lang w:val="ru-RU"/>
+        </w:rPr>
+        <w:t xml:space="preserve">) и </w:t>
+      </w:r>
+      <w:r>
+        <w:rPr>
+          <w:sz w:val="26"/>
+          <w:szCs w:val="26"/>
+        </w:rPr>
+        <w:t>cDouble</w:t>
+      </w:r>
+      <w:r>
+        <w:rPr>
+          <w:sz w:val="26"/>
+          <w:szCs w:val="26"/>
+          <w:lang w:val="ru-RU"/>
+        </w:rPr>
+        <w:t xml:space="preserve"> (тип </w:t>
+      </w:r>
+      <w:r>
+        <w:rPr>
+          <w:sz w:val="26"/>
+          <w:szCs w:val="26"/>
+          <w:lang w:val="fr-FR"/>
+        </w:rPr>
         <w:t xml:space="preserve">double) </w:t>
       </w:r>
       <w:r>
@@ -1646,302 +1663,7 @@
           <w:szCs w:val="26"/>
           <w:lang w:val="ru-RU"/>
         </w:rPr>
-        <w:t>— значение выражения 2^(–</w:t>
-      </w:r>
-      <w:proofErr w:type="gramStart"/>
-      <w:r>
-        <w:rPr>
-          <w:sz w:val="26"/>
-          <w:szCs w:val="26"/>
-        </w:rPr>
-        <w:t>x</w:t>
-      </w:r>
-      <w:r>
-        <w:rPr>
-          <w:sz w:val="26"/>
-          <w:szCs w:val="26"/>
-          <w:lang w:val="ru-RU"/>
-        </w:rPr>
-        <w:t>)·</w:t>
-      </w:r>
-      <w:proofErr w:type="gramEnd"/>
-      <w:r>
-        <w:rPr>
-          <w:sz w:val="26"/>
-          <w:szCs w:val="26"/>
-          <w:lang w:val="ru-RU"/>
-        </w:rPr>
-        <w:t>√(</w:t>
-      </w:r>
-      <w:r>
-        <w:rPr>
-          <w:sz w:val="26"/>
-          <w:szCs w:val="26"/>
-        </w:rPr>
-        <w:t>x</w:t>
-      </w:r>
-      <w:r>
-        <w:rPr>
-          <w:sz w:val="26"/>
-          <w:szCs w:val="26"/>
-          <w:lang w:val="ru-RU"/>
-        </w:rPr>
-        <w:t>+</w:t>
-      </w:r>
-      <w:proofErr w:type="gramStart"/>
-      <w:r>
-        <w:rPr>
-          <w:sz w:val="26"/>
-          <w:szCs w:val="26"/>
-          <w:lang w:val="ru-RU"/>
-        </w:rPr>
-        <w:t>4)·</w:t>
-      </w:r>
-      <w:proofErr w:type="gramEnd"/>
-      <w:r>
-        <w:rPr>
-          <w:sz w:val="26"/>
-          <w:szCs w:val="26"/>
-          <w:lang w:val="ru-RU"/>
-        </w:rPr>
-        <w:t>√|</w:t>
-      </w:r>
-      <w:r>
-        <w:rPr>
-          <w:sz w:val="26"/>
-          <w:szCs w:val="26"/>
-        </w:rPr>
-        <w:t>x</w:t>
-      </w:r>
-      <w:r>
-        <w:rPr>
-          <w:sz w:val="26"/>
-          <w:szCs w:val="26"/>
-          <w:lang w:val="ru-RU"/>
-        </w:rPr>
-        <w:t xml:space="preserve">|, либо сообщение об ошибке, если </w:t>
-      </w:r>
-      <w:r>
-        <w:rPr>
-          <w:sz w:val="26"/>
-          <w:szCs w:val="26"/>
-          <w:lang w:val="fr-FR"/>
-        </w:rPr>
-        <w:t xml:space="preserve">x </w:t>
-      </w:r>
-      <w:proofErr w:type="gramStart"/>
-      <w:r>
-        <w:rPr>
-          <w:sz w:val="26"/>
-          <w:szCs w:val="26"/>
-          <w:lang w:val="fr-FR"/>
-        </w:rPr>
-        <w:t xml:space="preserve">&lt; </w:t>
-      </w:r>
-      <w:r>
-        <w:rPr>
-          <w:sz w:val="26"/>
-          <w:szCs w:val="26"/>
-          <w:lang w:val="ru-RU"/>
-        </w:rPr>
-        <w:t>–</w:t>
-      </w:r>
-      <w:proofErr w:type="gramEnd"/>
-      <w:r>
-        <w:rPr>
-          <w:sz w:val="26"/>
-          <w:szCs w:val="26"/>
-          <w:lang w:val="ru-RU"/>
-        </w:rPr>
-        <w:t xml:space="preserve">4. Для задачи </w:t>
-      </w:r>
-      <w:r>
-        <w:rPr>
-          <w:sz w:val="26"/>
-          <w:szCs w:val="26"/>
-          <w:lang w:val="it-IT"/>
-        </w:rPr>
-        <w:t>2: inside (</w:t>
-      </w:r>
-      <w:r>
-        <w:rPr>
-          <w:sz w:val="26"/>
-          <w:szCs w:val="26"/>
-          <w:lang w:val="ru-RU"/>
-        </w:rPr>
-        <w:t xml:space="preserve">тип </w:t>
-      </w:r>
-      <w:proofErr w:type="spellStart"/>
-      <w:r>
-        <w:rPr>
-          <w:sz w:val="26"/>
-          <w:szCs w:val="26"/>
-          <w:lang w:val="nl-NL"/>
-        </w:rPr>
-        <w:t>bool</w:t>
-      </w:r>
-      <w:proofErr w:type="spellEnd"/>
-      <w:r>
-        <w:rPr>
-          <w:sz w:val="26"/>
-          <w:szCs w:val="26"/>
-          <w:lang w:val="nl-NL"/>
-        </w:rPr>
-        <w:t xml:space="preserve">) </w:t>
-      </w:r>
-      <w:r>
-        <w:rPr>
-          <w:sz w:val="26"/>
-          <w:szCs w:val="26"/>
-          <w:lang w:val="ru-RU"/>
-        </w:rPr>
-        <w:t xml:space="preserve">— </w:t>
-      </w:r>
-      <w:proofErr w:type="spellStart"/>
-      <w:r>
-        <w:rPr>
-          <w:sz w:val="26"/>
-          <w:szCs w:val="26"/>
-          <w:lang w:val="fr-FR"/>
-        </w:rPr>
-        <w:t>true</w:t>
-      </w:r>
-      <w:proofErr w:type="spellEnd"/>
-      <w:r>
-        <w:rPr>
-          <w:sz w:val="26"/>
-          <w:szCs w:val="26"/>
-          <w:lang w:val="fr-FR"/>
-        </w:rPr>
-        <w:t xml:space="preserve">, </w:t>
-      </w:r>
-      <w:r>
-        <w:rPr>
-          <w:sz w:val="26"/>
-          <w:szCs w:val="26"/>
-          <w:lang w:val="ru-RU"/>
-        </w:rPr>
-        <w:t xml:space="preserve">если точка принадлежит области, иначе </w:t>
-      </w:r>
-      <w:r>
-        <w:rPr>
-          <w:sz w:val="26"/>
-          <w:szCs w:val="26"/>
-        </w:rPr>
-        <w:t>false</w:t>
-      </w:r>
-      <w:r>
-        <w:rPr>
-          <w:sz w:val="26"/>
-          <w:szCs w:val="26"/>
-          <w:lang w:val="ru-RU"/>
-        </w:rPr>
-        <w:t xml:space="preserve">. Для задачи 3: </w:t>
-      </w:r>
-      <w:proofErr w:type="spellStart"/>
-      <w:r>
-        <w:rPr>
-          <w:sz w:val="26"/>
-          <w:szCs w:val="26"/>
-        </w:rPr>
-        <w:t>cFloat</w:t>
-      </w:r>
-      <w:proofErr w:type="spellEnd"/>
-      <w:r>
-        <w:rPr>
-          <w:sz w:val="26"/>
-          <w:szCs w:val="26"/>
-          <w:lang w:val="ru-RU"/>
-        </w:rPr>
-        <w:t xml:space="preserve"> (тип </w:t>
-      </w:r>
-      <w:r>
-        <w:rPr>
-          <w:sz w:val="26"/>
-          <w:szCs w:val="26"/>
-        </w:rPr>
-        <w:t>float</w:t>
-      </w:r>
-      <w:r>
-        <w:rPr>
-          <w:sz w:val="26"/>
-          <w:szCs w:val="26"/>
-          <w:lang w:val="ru-RU"/>
-        </w:rPr>
-        <w:t xml:space="preserve">) и </w:t>
-      </w:r>
-      <w:proofErr w:type="spellStart"/>
-      <w:r>
-        <w:rPr>
-          <w:sz w:val="26"/>
-          <w:szCs w:val="26"/>
-        </w:rPr>
-        <w:t>cDouble</w:t>
-      </w:r>
-      <w:proofErr w:type="spellEnd"/>
-      <w:r>
-        <w:rPr>
-          <w:sz w:val="26"/>
-          <w:szCs w:val="26"/>
-          <w:lang w:val="ru-RU"/>
-        </w:rPr>
-        <w:t xml:space="preserve"> (тип </w:t>
-      </w:r>
-      <w:r>
-        <w:rPr>
-          <w:sz w:val="26"/>
-          <w:szCs w:val="26"/>
-          <w:lang w:val="fr-FR"/>
-        </w:rPr>
-        <w:t xml:space="preserve">double) </w:t>
-      </w:r>
-      <w:r>
-        <w:rPr>
-          <w:sz w:val="26"/>
-          <w:szCs w:val="26"/>
-          <w:lang w:val="ru-RU"/>
-        </w:rPr>
-        <w:t>— результат (</w:t>
-      </w:r>
-      <w:r>
-        <w:rPr>
-          <w:sz w:val="26"/>
-          <w:szCs w:val="26"/>
-        </w:rPr>
-        <w:t>a</w:t>
-      </w:r>
-      <w:r>
-        <w:rPr>
-          <w:sz w:val="26"/>
-          <w:szCs w:val="26"/>
-          <w:lang w:val="ru-RU"/>
-        </w:rPr>
-        <w:t>+</w:t>
-      </w:r>
-      <w:proofErr w:type="gramStart"/>
-      <w:r>
-        <w:rPr>
-          <w:sz w:val="26"/>
-          <w:szCs w:val="26"/>
-        </w:rPr>
-        <w:t>b</w:t>
-      </w:r>
-      <w:r>
-        <w:rPr>
-          <w:sz w:val="26"/>
-          <w:szCs w:val="26"/>
-          <w:lang w:val="ru-RU"/>
-        </w:rPr>
-        <w:t>)²</w:t>
-      </w:r>
-      <w:proofErr w:type="gramEnd"/>
-      <w:r>
-        <w:rPr>
-          <w:sz w:val="26"/>
-          <w:szCs w:val="26"/>
-          <w:lang w:val="ru-RU"/>
-        </w:rPr>
-        <w:t xml:space="preserve"> в двух разных типах.</w:t>
+        <w:t>— результат ((a−b)³−a³)/(3ab²−b³−3a²b) в двух разных типах (аналитически это выражение тождественно равно 1).</w:t>
       </w:r>
     </w:p>
     <w:p>
@@ -2037,33 +1759,15 @@
           <w:szCs w:val="26"/>
           <w:lang w:val="da-DK"/>
         </w:rPr>
-        <w:t xml:space="preserve">), x </w:t>
-      </w:r>
-      <w:proofErr w:type="gramStart"/>
-      <w:r>
-        <w:rPr>
-          <w:sz w:val="26"/>
-          <w:szCs w:val="26"/>
-          <w:lang w:val="da-DK"/>
-        </w:rPr>
-        <w:t xml:space="preserve">&lt; </w:t>
-      </w:r>
-      <w:r>
-        <w:rPr>
-          <w:sz w:val="26"/>
-          <w:szCs w:val="26"/>
-          <w:lang w:val="ru-RU"/>
-        </w:rPr>
-        <w:t>–</w:t>
-      </w:r>
-      <w:proofErr w:type="gramEnd"/>
-      <w:r>
-        <w:rPr>
-          <w:sz w:val="26"/>
-          <w:szCs w:val="26"/>
-          <w:lang w:val="ru-RU"/>
-        </w:rPr>
-        <w:t xml:space="preserve">4 (выражение не определено), граничное значение </w:t>
+        <w:t xml:space="preserve">), x &lt; </w:t>
+      </w:r>
+      <w:r>
+        <w:rPr>
+          <w:sz w:val="26"/>
+          <w:szCs w:val="26"/>
+          <w:lang w:val="ru-RU"/>
+        </w:rPr>
+        <w:t xml:space="preserve">–4 (выражение не определено), граничное значение </w:t>
       </w:r>
       <w:r>
         <w:rPr>
@@ -2293,33 +1997,15 @@
           <w:szCs w:val="26"/>
           <w:lang w:val="fr-FR"/>
         </w:rPr>
-        <w:t xml:space="preserve">x </w:t>
-      </w:r>
-      <w:proofErr w:type="gramStart"/>
-      <w:r>
-        <w:rPr>
-          <w:sz w:val="26"/>
-          <w:szCs w:val="26"/>
-          <w:lang w:val="fr-FR"/>
-        </w:rPr>
-        <w:t xml:space="preserve">&lt; </w:t>
-      </w:r>
-      <w:r>
-        <w:rPr>
-          <w:sz w:val="26"/>
-          <w:szCs w:val="26"/>
-          <w:lang w:val="ru-RU"/>
-        </w:rPr>
-        <w:t>–</w:t>
-      </w:r>
-      <w:proofErr w:type="gramEnd"/>
-      <w:r>
-        <w:rPr>
-          <w:sz w:val="26"/>
-          <w:szCs w:val="26"/>
-          <w:lang w:val="ru-RU"/>
-        </w:rPr>
-        <w:t xml:space="preserve">4 обработана явно: программа проверяет условие </w:t>
+        <w:t xml:space="preserve">x &lt; </w:t>
+      </w:r>
+      <w:r>
+        <w:rPr>
+          <w:sz w:val="26"/>
+          <w:szCs w:val="26"/>
+          <w:lang w:val="ru-RU"/>
+        </w:rPr>
+        <w:t xml:space="preserve">–4 обработана явно: программа проверяет условие </w:t>
       </w:r>
       <w:r>
         <w:rPr>
@@ -2334,25 +2020,7 @@
           <w:szCs w:val="26"/>
           <w:lang w:val="ru-RU"/>
         </w:rPr>
-        <w:t xml:space="preserve"> + 4 </w:t>
-      </w:r>
-      <w:proofErr w:type="gramStart"/>
-      <w:r>
-        <w:rPr>
-          <w:sz w:val="26"/>
-          <w:szCs w:val="26"/>
-          <w:lang w:val="ru-RU"/>
-        </w:rPr>
-        <w:t>&lt; 0</w:t>
-      </w:r>
-      <w:proofErr w:type="gramEnd"/>
-      <w:r>
-        <w:rPr>
-          <w:sz w:val="26"/>
-          <w:szCs w:val="26"/>
-          <w:lang w:val="ru-RU"/>
-        </w:rPr>
-        <w:t xml:space="preserve"> и вместо результата выводит текстовое сообщение об ошибке. Ограничение текущей реализации: ввод </w:t>
+        <w:t xml:space="preserve"> + 4 &lt; 0 и вместо результата выводит текстовое сообщение об ошибке. Ограничение текущей реализации: ввод </w:t>
       </w:r>
       <w:r>
         <w:rPr>
@@ -2489,7 +2157,6 @@
         </w:rPr>
         <w:t xml:space="preserve"> выбросят необработанное исключение </w:t>
       </w:r>
-      <w:proofErr w:type="spellStart"/>
       <w:r>
         <w:rPr>
           <w:sz w:val="26"/>
@@ -2497,32 +2164,13 @@
         </w:rPr>
         <w:t>FormatException</w:t>
       </w:r>
-      <w:proofErr w:type="spellEnd"/>
-      <w:r>
-        <w:rPr>
-          <w:sz w:val="26"/>
-          <w:szCs w:val="26"/>
-          <w:lang w:val="ru-RU"/>
-        </w:rPr>
-        <w:t xml:space="preserve"> и программа завершится </w:t>
-      </w:r>
-      <w:proofErr w:type="spellStart"/>
-      <w:r>
-        <w:rPr>
-          <w:sz w:val="26"/>
-          <w:szCs w:val="26"/>
-          <w:lang w:val="ru-RU"/>
-        </w:rPr>
-        <w:t>аварийно</w:t>
-      </w:r>
-      <w:proofErr w:type="spellEnd"/>
-      <w:r>
-        <w:rPr>
-          <w:sz w:val="26"/>
-          <w:szCs w:val="26"/>
-          <w:lang w:val="ru-RU"/>
-        </w:rPr>
-        <w:t>. Это сознательно отмечено как недостаток и вынесено в раздел «Вывод» как направление доработки, а не скрыто.</w:t>
+      <w:r>
+        <w:rPr>
+          <w:sz w:val="26"/>
+          <w:szCs w:val="26"/>
+          <w:lang w:val="ru-RU"/>
+        </w:rPr>
+        <w:t xml:space="preserve"> и программа завершится аварийно. Это сознательно отмечено как недостаток и вынесено в раздел «Вывод» как направление доработки, а не скрыто.</w:t>
       </w:r>
     </w:p>
     <w:p>
@@ -2550,23 +2198,7 @@
           <w:szCs w:val="26"/>
           <w:lang w:val="ru-RU"/>
         </w:rPr>
-        <w:t xml:space="preserve">Задача </w:t>
-      </w:r>
-      <w:r>
-        <w:rPr>
-          <w:sz w:val="26"/>
-          <w:szCs w:val="26"/>
-          <w:lang w:val="ru-RU"/>
-        </w:rPr>
-        <w:t xml:space="preserve">1: </w:t>
-      </w:r>
-      <w:r>
-        <w:rPr>
-          <w:sz w:val="26"/>
-          <w:szCs w:val="26"/>
-          <w:lang w:val="ru-RU"/>
-        </w:rPr>
-        <w:t xml:space="preserve">ввести </w:t>
+        <w:t xml:space="preserve">Задача 1: ввести </w:t>
       </w:r>
       <w:r>
         <w:rPr>
@@ -2701,18 +2333,8 @@
           <w:szCs w:val="26"/>
           <w:lang w:val="ru-RU"/>
         </w:rPr>
-        <w:t>+</w:t>
-      </w:r>
-      <w:proofErr w:type="gramStart"/>
-      <w:r>
-        <w:rPr>
-          <w:sz w:val="26"/>
-          <w:szCs w:val="26"/>
-          <w:lang w:val="ru-RU"/>
-        </w:rPr>
-        <w:t>+&lt;</w:t>
-      </w:r>
-      <w:proofErr w:type="gramEnd"/>
+        <w:t>++&lt;</w:t>
+      </w:r>
       <w:r>
         <w:rPr>
           <w:sz w:val="26"/>
@@ -2773,7 +2395,6 @@
         </w:rPr>
         <w:t>3 = --</w:t>
       </w:r>
-      <w:proofErr w:type="gramStart"/>
       <w:r>
         <w:rPr>
           <w:sz w:val="26"/>
@@ -2796,7 +2417,6 @@
         </w:rPr>
         <w:t>n</w:t>
       </w:r>
-      <w:proofErr w:type="gramEnd"/>
       <w:r>
         <w:rPr>
           <w:sz w:val="26"/>
@@ -2934,7 +2554,6 @@
         </w:rPr>
         <w:t xml:space="preserve">inside. </w:t>
       </w:r>
-      <w:proofErr w:type="spellStart"/>
       <w:r>
         <w:rPr>
           <w:sz w:val="26"/>
@@ -2942,7 +2561,6 @@
         </w:rPr>
         <w:t>Задача</w:t>
       </w:r>
-      <w:proofErr w:type="spellEnd"/>
       <w:r>
         <w:rPr>
           <w:sz w:val="26"/>
@@ -2951,7 +2569,6 @@
         </w:rPr>
         <w:t xml:space="preserve"> 3: </w:t>
       </w:r>
-      <w:proofErr w:type="spellStart"/>
       <w:r>
         <w:rPr>
           <w:sz w:val="26"/>
@@ -2959,7 +2576,6 @@
         </w:rPr>
         <w:t>задать</w:t>
       </w:r>
-      <w:proofErr w:type="spellEnd"/>
       <w:r>
         <w:rPr>
           <w:sz w:val="26"/>
@@ -2968,7 +2584,6 @@
         </w:rPr>
         <w:t xml:space="preserve"> a = 1000, b = 0.0001; </w:t>
       </w:r>
-      <w:proofErr w:type="spellStart"/>
       <w:r>
         <w:rPr>
           <w:sz w:val="26"/>
@@ -2976,7 +2591,6 @@
         </w:rPr>
         <w:t>привести</w:t>
       </w:r>
-      <w:proofErr w:type="spellEnd"/>
       <w:r>
         <w:rPr>
           <w:sz w:val="26"/>
@@ -3015,7 +2629,6 @@
         </w:rPr>
         <w:t xml:space="preserve"> </w:t>
       </w:r>
-      <w:proofErr w:type="spellStart"/>
       <w:r>
         <w:rPr>
           <w:sz w:val="26"/>
@@ -3023,190 +2636,74 @@
         </w:rPr>
         <w:t>вычислить</w:t>
       </w:r>
-      <w:proofErr w:type="spellEnd"/>
       <w:r>
         <w:rPr>
           <w:sz w:val="26"/>
           <w:szCs w:val="26"/>
           <w:lang w:val="it-IT"/>
         </w:rPr>
+        <w:t xml:space="preserve"> cFloat = ((af−bf)³−af³)/(3af·bf²−bf³−3af²·bf); </w:t>
+      </w:r>
+      <w:r>
+        <w:rPr>
+          <w:sz w:val="26"/>
+          <w:szCs w:val="26"/>
+        </w:rPr>
+        <w:t>вычислить</w:t>
+      </w:r>
+      <w:r>
+        <w:rPr>
+          <w:sz w:val="26"/>
+          <w:szCs w:val="26"/>
+          <w:lang w:val="it-IT"/>
+        </w:rPr>
+        <w:t xml:space="preserve"> cDouble = ((a−b)³−a³)/(3ab²−b³−3a²b) </w:t>
+      </w:r>
+      <w:r>
+        <w:rPr>
+          <w:sz w:val="26"/>
+          <w:szCs w:val="26"/>
+        </w:rPr>
+        <w:t>в</w:t>
+      </w:r>
+      <w:r>
+        <w:rPr>
+          <w:sz w:val="26"/>
+          <w:szCs w:val="26"/>
+          <w:lang w:val="it-IT"/>
+        </w:rPr>
+        <w:t xml:space="preserve"> double; </w:t>
+      </w:r>
+      <w:r>
+        <w:rPr>
+          <w:sz w:val="26"/>
+          <w:szCs w:val="26"/>
+        </w:rPr>
+        <w:t>вывести</w:t>
+      </w:r>
+      <w:r>
+        <w:rPr>
+          <w:sz w:val="26"/>
+          <w:szCs w:val="26"/>
+          <w:lang w:val="it-IT"/>
+        </w:rPr>
         <w:t xml:space="preserve"> </w:t>
       </w:r>
-      <w:proofErr w:type="spellStart"/>
+      <w:r>
+        <w:rPr>
+          <w:sz w:val="26"/>
+          <w:szCs w:val="26"/>
+        </w:rPr>
+        <w:t>оба</w:t>
+      </w:r>
       <w:r>
         <w:rPr>
           <w:sz w:val="26"/>
           <w:szCs w:val="26"/>
           <w:lang w:val="it-IT"/>
         </w:rPr>
-        <w:t>cFloat</w:t>
-      </w:r>
-      <w:proofErr w:type="spellEnd"/>
-      <w:r>
-        <w:rPr>
-          <w:sz w:val="26"/>
-          <w:szCs w:val="26"/>
-          <w:lang w:val="it-IT"/>
-        </w:rPr>
-        <w:t xml:space="preserve"> = (</w:t>
-      </w:r>
-      <w:proofErr w:type="spellStart"/>
-      <w:r>
-        <w:rPr>
-          <w:sz w:val="26"/>
-          <w:szCs w:val="26"/>
-          <w:lang w:val="it-IT"/>
-        </w:rPr>
-        <w:t>af+</w:t>
-      </w:r>
-      <w:proofErr w:type="gramStart"/>
-      <w:r>
-        <w:rPr>
-          <w:sz w:val="26"/>
-          <w:szCs w:val="26"/>
-          <w:lang w:val="it-IT"/>
-        </w:rPr>
-        <w:t>bf</w:t>
-      </w:r>
-      <w:proofErr w:type="spellEnd"/>
-      <w:r>
-        <w:rPr>
-          <w:sz w:val="26"/>
-          <w:szCs w:val="26"/>
-          <w:lang w:val="it-IT"/>
-        </w:rPr>
-        <w:t>)²</w:t>
-      </w:r>
-      <w:proofErr w:type="gramEnd"/>
-      <w:r>
-        <w:rPr>
-          <w:sz w:val="26"/>
-          <w:szCs w:val="26"/>
-          <w:lang w:val="it-IT"/>
-        </w:rPr>
-        <w:t xml:space="preserve">; </w:t>
-      </w:r>
-      <w:proofErr w:type="spellStart"/>
-      <w:r>
-        <w:rPr>
-          <w:sz w:val="26"/>
-          <w:szCs w:val="26"/>
-        </w:rPr>
-        <w:t>вычислить</w:t>
-      </w:r>
-      <w:proofErr w:type="spellEnd"/>
-      <w:r>
-        <w:rPr>
-          <w:sz w:val="26"/>
-          <w:szCs w:val="26"/>
-          <w:lang w:val="it-IT"/>
-        </w:rPr>
         <w:t xml:space="preserve"> </w:t>
       </w:r>
-      <w:proofErr w:type="spellStart"/>
-      <w:r>
-        <w:rPr>
-          <w:sz w:val="26"/>
-          <w:szCs w:val="26"/>
-          <w:lang w:val="it-IT"/>
-        </w:rPr>
-        <w:t>cDouble</w:t>
-      </w:r>
-      <w:proofErr w:type="spellEnd"/>
-      <w:r>
-        <w:rPr>
-          <w:sz w:val="26"/>
-          <w:szCs w:val="26"/>
-          <w:lang w:val="it-IT"/>
-        </w:rPr>
-        <w:t xml:space="preserve"> = (</w:t>
-      </w:r>
-      <w:proofErr w:type="spellStart"/>
-      <w:r>
-        <w:rPr>
-          <w:sz w:val="26"/>
-          <w:szCs w:val="26"/>
-          <w:lang w:val="it-IT"/>
-        </w:rPr>
-        <w:t>a+</w:t>
-      </w:r>
-      <w:proofErr w:type="gramStart"/>
-      <w:r>
-        <w:rPr>
-          <w:sz w:val="26"/>
-          <w:szCs w:val="26"/>
-          <w:lang w:val="it-IT"/>
-        </w:rPr>
-        <w:t>b</w:t>
-      </w:r>
-      <w:proofErr w:type="spellEnd"/>
-      <w:r>
-        <w:rPr>
-          <w:sz w:val="26"/>
-          <w:szCs w:val="26"/>
-          <w:lang w:val="it-IT"/>
-        </w:rPr>
-        <w:t>)²</w:t>
-      </w:r>
-      <w:proofErr w:type="gramEnd"/>
-      <w:r>
-        <w:rPr>
-          <w:sz w:val="26"/>
-          <w:szCs w:val="26"/>
-          <w:lang w:val="it-IT"/>
-        </w:rPr>
-        <w:t xml:space="preserve"> </w:t>
-      </w:r>
-      <w:r>
-        <w:rPr>
-          <w:sz w:val="26"/>
-          <w:szCs w:val="26"/>
-        </w:rPr>
-        <w:t>в</w:t>
-      </w:r>
-      <w:r>
-        <w:rPr>
-          <w:sz w:val="26"/>
-          <w:szCs w:val="26"/>
-          <w:lang w:val="it-IT"/>
-        </w:rPr>
-        <w:t xml:space="preserve"> double; </w:t>
-      </w:r>
-      <w:proofErr w:type="spellStart"/>
-      <w:r>
-        <w:rPr>
-          <w:sz w:val="26"/>
-          <w:szCs w:val="26"/>
-        </w:rPr>
-        <w:t>вывести</w:t>
-      </w:r>
-      <w:proofErr w:type="spellEnd"/>
-      <w:r>
-        <w:rPr>
-          <w:sz w:val="26"/>
-          <w:szCs w:val="26"/>
-          <w:lang w:val="it-IT"/>
-        </w:rPr>
-        <w:t xml:space="preserve"> </w:t>
-      </w:r>
-      <w:proofErr w:type="spellStart"/>
-      <w:r>
-        <w:rPr>
-          <w:sz w:val="26"/>
-          <w:szCs w:val="26"/>
-        </w:rPr>
-        <w:t>оба</w:t>
-      </w:r>
-      <w:proofErr w:type="spellEnd"/>
-      <w:r>
-        <w:rPr>
-          <w:sz w:val="26"/>
-          <w:szCs w:val="26"/>
-          <w:lang w:val="it-IT"/>
-        </w:rPr>
-        <w:t xml:space="preserve"> </w:t>
-      </w:r>
-      <w:proofErr w:type="spellStart"/>
       <w:r>
         <w:rPr>
           <w:sz w:val="26"/>
@@ -3214,7 +2711,6 @@
         </w:rPr>
         <w:t>значения</w:t>
       </w:r>
-      <w:proofErr w:type="spellEnd"/>
       <w:r>
         <w:rPr>
           <w:sz w:val="26"/>
@@ -3405,6 +2901,59 @@
           <w:lang w:val="ru-RU"/>
         </w:rPr>
       </w:pPr>
+      <w:r>
+        <w:rPr>
+          <w:noProof/>
+          <w:lang w:val="ru-RU"/>
+          <w14:textOutline w14:w="0" w14:cap="rnd" w14:cmpd="sng" w14:algn="ctr">
+            <w14:noFill/>
+            <w14:prstDash w14:val="solid"/>
+            <w14:bevel/>
+          </w14:textOutline>
+        </w:rPr>
+        <w:lastRenderedPageBreak/>
+        <w:drawing>
+          <wp:inline distT="0" distB="0" distL="0" distR="0" wp14:anchorId="1A8908B3" wp14:editId="3F4347A9">
+            <wp:extent cx="5936615" cy="3974465"/>
+            <wp:effectExtent l="0" t="0" r="0" b="635"/>
+            <wp:docPr id="165162111" name="Picture 1"/>
+            <wp:cNvGraphicFramePr>
+              <a:graphicFrameLocks xmlns:a="http://schemas.openxmlformats.org/drawingml/2006/main" noChangeAspect="1"/>
+            </wp:cNvGraphicFramePr>
+            <a:graphic xmlns:a="http://schemas.openxmlformats.org/drawingml/2006/main">
+              <a:graphicData uri="http://schemas.openxmlformats.org/drawingml/2006/picture">
+                <pic:pic xmlns:pic="http://schemas.openxmlformats.org/drawingml/2006/picture">
+                  <pic:nvPicPr>
+                    <pic:cNvPr id="165162111" name="Picture 165162111"/>
+                    <pic:cNvPicPr/>
+                  </pic:nvPicPr>
+                  <pic:blipFill>
+                    <a:blip r:embed="rId8" cstate="print">
+                      <a:extLst>
+                        <a:ext uri="{28A0092B-C50C-407E-A947-70E740481C1C}">
+                          <a14:useLocalDpi xmlns:a14="http://schemas.microsoft.com/office/drawing/2010/main" val="0"/>
+                        </a:ext>
+                      </a:extLst>
+                    </a:blip>
+                    <a:stretch>
+                      <a:fillRect/>
+                    </a:stretch>
+                  </pic:blipFill>
+                  <pic:spPr>
+                    <a:xfrm>
+                      <a:off x="0" y="0"/>
+                      <a:ext cx="5936615" cy="3974465"/>
+                    </a:xfrm>
+                    <a:prstGeom prst="rect">
+                      <a:avLst/>
+                    </a:prstGeom>
+                  </pic:spPr>
+                </pic:pic>
+              </a:graphicData>
+            </a:graphic>
+          </wp:inline>
+        </w:drawing>
+      </w:r>
     </w:p>
     <w:p>
       <w:pPr>
@@ -3414,11 +2963,55 @@
           <w:lang w:val="ru-RU"/>
         </w:rPr>
       </w:pPr>
+    </w:p>
+    <w:p>
+      <w:pPr>
+        <w:pStyle w:val="BodyA"/>
+        <w:jc w:val="center"/>
+        <w:rPr>
+          <w:lang w:val="ru-RU"/>
+        </w:rPr>
+      </w:pPr>
+    </w:p>
+    <w:p>
+      <w:pPr>
+        <w:pStyle w:val="BodyA"/>
+        <w:jc w:val="center"/>
+        <w:rPr>
+          <w:lang w:val="ru-RU"/>
+        </w:rPr>
+      </w:pPr>
+    </w:p>
+    <w:p>
+      <w:pPr>
+        <w:pStyle w:val="BodyA"/>
+        <w:jc w:val="center"/>
+        <w:rPr>
+          <w:lang w:val="ru-RU"/>
+        </w:rPr>
+      </w:pPr>
+    </w:p>
+    <w:p>
+      <w:pPr>
+        <w:pStyle w:val="BodyA"/>
+        <w:jc w:val="center"/>
+        <w:rPr>
+          <w:lang w:val="ru-RU"/>
+        </w:rPr>
+      </w:pPr>
+    </w:p>
+    <w:p>
+      <w:pPr>
+        <w:pStyle w:val="BodyA"/>
+        <w:jc w:val="center"/>
+        <w:rPr>
+          <w:lang w:val="ru-RU"/>
+        </w:rPr>
+      </w:pPr>
       <w:r>
         <w:rPr>
           <w:noProof/>
         </w:rPr>
-        <w:lastRenderedPageBreak/>
         <w:drawing>
           <wp:inline distT="0" distB="0" distL="0" distR="0" wp14:anchorId="22129BC0" wp14:editId="3EEDCB26">
             <wp:extent cx="3960000" cy="3192322"/>
@@ -3435,7 +3028,7 @@
                     </pic:cNvPicPr>
                   </pic:nvPicPr>
                   <pic:blipFill>
-                    <a:blip r:embed="rId8"/>
+                    <a:blip r:embed="rId9"/>
                     <a:stretch>
                       <a:fillRect/>
                     </a:stretch>
@@ -3460,43 +3053,186 @@
           </wp:inline>
         </w:drawing>
       </w:r>
+    </w:p>
+    <w:p>
+      <w:pPr>
+        <w:pStyle w:val="BodyA"/>
+        <w:spacing w:before="240" w:after="200"/>
+        <w:jc w:val="center"/>
+        <w:rPr>
+          <w:b/>
+          <w:bCs/>
+          <w:sz w:val="32"/>
+          <w:szCs w:val="32"/>
+          <w:lang w:val="ru-RU"/>
+        </w:rPr>
+      </w:pPr>
+    </w:p>
+    <w:p>
+      <w:pPr>
+        <w:pStyle w:val="BodyA"/>
+        <w:spacing w:before="240" w:after="200"/>
+        <w:jc w:val="center"/>
+        <w:rPr>
+          <w:b/>
+          <w:bCs/>
+          <w:sz w:val="32"/>
+          <w:szCs w:val="32"/>
+          <w:lang w:val="ru-RU"/>
+        </w:rPr>
+      </w:pPr>
+    </w:p>
+    <w:p>
+      <w:pPr>
+        <w:pStyle w:val="BodyA"/>
+        <w:spacing w:before="240" w:after="200"/>
+        <w:jc w:val="center"/>
+        <w:rPr>
+          <w:b/>
+          <w:bCs/>
+          <w:sz w:val="32"/>
+          <w:szCs w:val="32"/>
+          <w:lang w:val="ru-RU"/>
+        </w:rPr>
+      </w:pPr>
+    </w:p>
+    <w:p>
+      <w:pPr>
+        <w:pStyle w:val="BodyA"/>
+        <w:spacing w:before="240" w:after="200"/>
+        <w:jc w:val="center"/>
+        <w:rPr>
+          <w:b/>
+          <w:bCs/>
+          <w:sz w:val="32"/>
+          <w:szCs w:val="32"/>
+          <w:lang w:val="ru-RU"/>
+        </w:rPr>
+      </w:pPr>
+    </w:p>
+    <w:p>
+      <w:pPr>
+        <w:pStyle w:val="BodyA"/>
+        <w:spacing w:before="240" w:after="200"/>
+        <w:jc w:val="center"/>
+        <w:rPr>
+          <w:b/>
+          <w:bCs/>
+          <w:sz w:val="32"/>
+          <w:szCs w:val="32"/>
+          <w:lang w:val="ru-RU"/>
+        </w:rPr>
+      </w:pPr>
+    </w:p>
+    <w:p>
+      <w:pPr>
+        <w:pStyle w:val="BodyA"/>
+        <w:spacing w:before="240" w:after="200"/>
+        <w:jc w:val="center"/>
+        <w:rPr>
+          <w:lang w:val="ru-RU"/>
+        </w:rPr>
+      </w:pPr>
+      <w:r>
+        <w:rPr>
+          <w:b/>
+          <w:bCs/>
+          <w:sz w:val="32"/>
+          <w:szCs w:val="32"/>
+          <w:lang w:val="ru-RU"/>
+        </w:rPr>
+        <w:t>4. Тестирование</w:t>
+      </w:r>
+    </w:p>
+    <w:p>
+      <w:pPr>
+        <w:pStyle w:val="BodyA"/>
+        <w:spacing w:after="120" w:line="360" w:lineRule="auto"/>
+        <w:jc w:val="both"/>
+        <w:rPr>
+          <w:lang w:val="ru-RU"/>
+        </w:rPr>
+      </w:pPr>
+      <w:r>
+        <w:rPr>
+          <w:sz w:val="26"/>
+          <w:szCs w:val="26"/>
+          <w:lang w:val="ru-RU"/>
+        </w:rPr>
+        <w:t>Для проверки работоспособности программы составлено 19 тестов (</w:t>
+      </w:r>
+      <w:r>
+        <w:rPr>
+          <w:sz w:val="26"/>
+          <w:szCs w:val="26"/>
+        </w:rPr>
+        <w:t>T</w:t>
+      </w:r>
+      <w:r>
+        <w:rPr>
+          <w:sz w:val="26"/>
+          <w:szCs w:val="26"/>
+          <w:lang w:val="ru-RU"/>
+        </w:rPr>
+        <w:t>01–</w:t>
+      </w:r>
+      <w:r>
+        <w:rPr>
+          <w:sz w:val="26"/>
+          <w:szCs w:val="26"/>
+        </w:rPr>
+        <w:t>T</w:t>
+      </w:r>
+      <w:r>
+        <w:rPr>
+          <w:sz w:val="26"/>
+          <w:szCs w:val="26"/>
+          <w:lang w:val="ru-RU"/>
+        </w:rPr>
+        <w:t>19), покрывающих все три задачи варианта 22. Ниже приведены таблица тестов и две матрицы покрытия — по критериям чёрного и белого ящика, — оформленные по образцу таблицы тестов, предоставленной для лабораторной работы №1.</w:t>
+      </w:r>
+    </w:p>
+    <w:p>
+      <w:pPr>
+        <w:pStyle w:val="BodyA"/>
+        <w:spacing w:after="80" w:line="360" w:lineRule="auto"/>
+        <w:jc w:val="both"/>
+      </w:pPr>
+      <w:r>
+        <w:rPr>
+          <w:b/>
+          <w:bCs/>
+          <w:sz w:val="26"/>
+          <w:szCs w:val="26"/>
+        </w:rPr>
+        <w:t xml:space="preserve">Таблица тестов — Задача 1.</w:t>
+      </w:r>
+    </w:p>
+    <w:p>
+      <w:pPr>
+        <w:jc w:val="center"/>
+      </w:pPr>
       <w:r>
         <w:rPr>
           <w:noProof/>
         </w:rPr>
         <w:drawing>
-          <wp:anchor distT="152400" distB="152400" distL="152400" distR="152400" simplePos="0" relativeHeight="251660288" behindDoc="0" locked="0" layoutInCell="1" allowOverlap="1" wp14:anchorId="439745B3" wp14:editId="1D59B627">
-            <wp:simplePos x="0" y="0"/>
-            <wp:positionH relativeFrom="page">
-              <wp:posOffset>803593</wp:posOffset>
-            </wp:positionH>
-            <wp:positionV relativeFrom="page">
-              <wp:posOffset>487680</wp:posOffset>
-            </wp:positionV>
-            <wp:extent cx="5936616" cy="4580536"/>
+          <wp:inline distT="0" distB="0" distL="0" distR="0" wp14:anchorId="689C1EE4" wp14:editId="485A02CB">
+            <wp:extent cx="5940000" cy="3093092"/>
             <wp:effectExtent l="0" t="0" r="0" b="0"/>
-            <wp:wrapThrough wrapText="bothSides" distL="152400" distR="152400">
-              <wp:wrapPolygon edited="1">
-                <wp:start x="0" y="0"/>
-                <wp:lineTo x="21600" y="0"/>
-                <wp:lineTo x="21600" y="21625"/>
-                <wp:lineTo x="0" y="21625"/>
-                <wp:lineTo x="0" y="0"/>
-              </wp:wrapPolygon>
-            </wp:wrapThrough>
-            <wp:docPr id="1073741828" name="officeArt object" descr="Screenshot 2026-09-26 at 12.30.47.png"/>
-            <wp:cNvGraphicFramePr/>
+            <wp:docPr id="1073741829" name="Picture 1073741829"/>
+            <wp:cNvGraphicFramePr>
+              <a:graphicFrameLocks xmlns:a="http://schemas.openxmlformats.org/drawingml/2006/main" noChangeAspect="1"/>
+            </wp:cNvGraphicFramePr>
             <a:graphic xmlns:a="http://schemas.openxmlformats.org/drawingml/2006/main">
               <a:graphicData uri="http://schemas.openxmlformats.org/drawingml/2006/picture">
                 <pic:pic xmlns:pic="http://schemas.openxmlformats.org/drawingml/2006/picture">
                   <pic:nvPicPr>
-                    <pic:cNvPr id="1073741828" name="Screenshot 2026-09-26 at 12.30.47.png" descr="Screenshot 2026-09-26 at 12.30.47.png"/>
-                    <pic:cNvPicPr>
-                      <a:picLocks noChangeAspect="1"/>
-                    </pic:cNvPicPr>
+                    <pic:cNvPr id="0" name="Тесты Задача 1.png"/>
+                    <pic:cNvPicPr/>
                   </pic:nvPicPr>
                   <pic:blipFill>
-                    <a:blip r:embed="rId9"/>
+                    <a:blip r:embed="rId10"/>
                     <a:stretch>
                       <a:fillRect/>
                     </a:stretch>
@@ -3504,29 +3240,56 @@
                   <pic:spPr>
                     <a:xfrm>
                       <a:off x="0" y="0"/>
-                      <a:ext cx="5936616" cy="4580536"/>
+                      <a:ext cx="5940000" cy="3093092"/>
                     </a:xfrm>
                     <a:prstGeom prst="rect">
                       <a:avLst/>
                     </a:prstGeom>
-                    <a:ln w="12700" cap="flat">
-                      <a:noFill/>
-                      <a:miter lim="400000"/>
-                    </a:ln>
-                    <a:effectLst/>
                   </pic:spPr>
                 </pic:pic>
               </a:graphicData>
             </a:graphic>
-          </wp:anchor>
+          </wp:inline>
         </w:drawing>
       </w:r>
     </w:p>
     <w:p>
       <w:pPr>
         <w:pStyle w:val="BodyA"/>
-        <w:spacing w:before="240" w:after="200"/>
+        <w:widowControl w:val="0"/>
+        <w:spacing w:after="80"/>
+        <w:ind w:left="108" w:hanging="108"/>
         <w:jc w:val="center"/>
+        <w:rPr>
+          <w:lang w:val="ru-RU"/>
+        </w:rPr>
+      </w:pPr>
+    </w:p>
+    <w:p>
+      <w:pPr>
+        <w:pStyle w:val="BodyA"/>
+        <w:widowControl w:val="0"/>
+        <w:spacing w:after="80"/>
+        <w:jc w:val="center"/>
+        <w:rPr>
+          <w:lang w:val="ru-RU"/>
+        </w:rPr>
+      </w:pPr>
+    </w:p>
+    <w:p>
+      <w:pPr>
+        <w:pStyle w:val="BodyA"/>
+        <w:spacing w:after="120"/>
+        <w:rPr>
+          <w:lang w:val="ru-RU"/>
+        </w:rPr>
+      </w:pPr>
+    </w:p>
+    <w:p>
+      <w:pPr>
+        <w:pStyle w:val="BodyA"/>
+        <w:spacing w:after="80" w:line="360" w:lineRule="auto"/>
+        <w:jc w:val="both"/>
         <w:rPr>
           <w:lang w:val="ru-RU"/>
         </w:rPr>
@@ -3535,12 +3298,222 @@
         <w:rPr>
           <w:b/>
           <w:bCs/>
-          <w:sz w:val="32"/>
-          <w:szCs w:val="32"/>
-          <w:lang w:val="ru-RU"/>
+          <w:sz w:val="26"/>
+          <w:szCs w:val="26"/>
+          <w:lang w:val="ru-RU"/>
+        </w:rPr>
+        <w:t xml:space="preserve">Таблица тестов — Задача 2. Тесты </w:t>
+      </w:r>
+      <w:r>
+        <w:rPr>
+          <w:b/>
+          <w:bCs/>
+          <w:sz w:val="26"/>
+          <w:szCs w:val="26"/>
+        </w:rPr>
+        <w:t>T</w:t>
+      </w:r>
+      <w:r>
+        <w:rPr>
+          <w:b/>
+          <w:bCs/>
+          <w:sz w:val="26"/>
+          <w:szCs w:val="26"/>
+          <w:lang w:val="ru-RU"/>
+        </w:rPr>
+        <w:t>15–</w:t>
+      </w:r>
+      <w:r>
+        <w:rPr>
+          <w:b/>
+          <w:bCs/>
+          <w:sz w:val="26"/>
+          <w:szCs w:val="26"/>
+        </w:rPr>
+        <w:t>T</w:t>
+      </w:r>
+      <w:r>
+        <w:rPr>
+          <w:b/>
+          <w:bCs/>
+          <w:sz w:val="26"/>
+          <w:szCs w:val="26"/>
+          <w:lang w:val="ru-RU"/>
+        </w:rPr>
+        <w:t>18 подобраны так, чтобы в каждом из них нарушалось ровно одно из четырёх условий конъюнкции, а не все сразу.</w:t>
+      </w:r>
+    </w:p>
+    <w:p>
+      <w:pPr>
+        <w:jc w:val="center"/>
+      </w:pPr>
+      <w:r>
+        <w:rPr>
+          <w:noProof/>
         </w:rPr>
         <w:lastRenderedPageBreak/>
-        <w:t>4. Тестирование</w:t>
+        <w:drawing>
+          <wp:inline distT="0" distB="0" distL="0" distR="0" wp14:anchorId="402A0A26" wp14:editId="27D43CEE">
+            <wp:extent cx="5940000" cy="2506043"/>
+            <wp:effectExtent l="0" t="0" r="0" b="0"/>
+            <wp:docPr id="1073741830" name="Picture 1073741830"/>
+            <wp:cNvGraphicFramePr>
+              <a:graphicFrameLocks xmlns:a="http://schemas.openxmlformats.org/drawingml/2006/main" noChangeAspect="1"/>
+            </wp:cNvGraphicFramePr>
+            <a:graphic xmlns:a="http://schemas.openxmlformats.org/drawingml/2006/main">
+              <a:graphicData uri="http://schemas.openxmlformats.org/drawingml/2006/picture">
+                <pic:pic xmlns:pic="http://schemas.openxmlformats.org/drawingml/2006/picture">
+                  <pic:nvPicPr>
+                    <pic:cNvPr id="0" name="Тесты Задача 2.png"/>
+                    <pic:cNvPicPr/>
+                  </pic:nvPicPr>
+                  <pic:blipFill>
+                    <a:blip r:embed="rId11"/>
+                    <a:stretch>
+                      <a:fillRect/>
+                    </a:stretch>
+                  </pic:blipFill>
+                  <pic:spPr>
+                    <a:xfrm>
+                      <a:off x="0" y="0"/>
+                      <a:ext cx="5940000" cy="2506043"/>
+                    </a:xfrm>
+                    <a:prstGeom prst="rect">
+                      <a:avLst/>
+                    </a:prstGeom>
+                  </pic:spPr>
+                </pic:pic>
+              </a:graphicData>
+            </a:graphic>
+          </wp:inline>
+        </w:drawing>
+      </w:r>
+    </w:p>
+    <w:p>
+      <w:pPr>
+        <w:pStyle w:val="BodyA"/>
+        <w:widowControl w:val="0"/>
+        <w:spacing w:after="80"/>
+        <w:ind w:left="108" w:hanging="108"/>
+        <w:jc w:val="center"/>
+      </w:pPr>
+    </w:p>
+    <w:p>
+      <w:pPr>
+        <w:pStyle w:val="BodyA"/>
+        <w:widowControl w:val="0"/>
+        <w:spacing w:after="80"/>
+        <w:jc w:val="center"/>
+      </w:pPr>
+    </w:p>
+    <w:p>
+      <w:pPr>
+        <w:pStyle w:val="BodyA"/>
+        <w:spacing w:after="120"/>
+      </w:pPr>
+    </w:p>
+    <w:p>
+      <w:pPr>
+        <w:pStyle w:val="BodyA"/>
+        <w:spacing w:after="80" w:line="360" w:lineRule="auto"/>
+        <w:jc w:val="both"/>
+      </w:pPr>
+      <w:r>
+        <w:rPr>
+          <w:b/>
+          <w:bCs/>
+          <w:sz w:val="26"/>
+          <w:szCs w:val="26"/>
+        </w:rPr>
+        <w:t xml:space="preserve">Таблица тестов — Задача 3.</w:t>
+      </w:r>
+    </w:p>
+    <w:p>
+      <w:pPr>
+        <w:jc w:val="center"/>
+      </w:pPr>
+      <w:r>
+        <w:rPr>
+          <w:noProof/>
+        </w:rPr>
+        <w:drawing>
+          <wp:inline distT="0" distB="0" distL="0" distR="0" wp14:anchorId="14324A3C" wp14:editId="6856961E">
+            <wp:extent cx="5940000" cy="846412"/>
+            <wp:effectExtent l="0" t="0" r="0" b="0"/>
+            <wp:docPr id="1073741831" name="Picture 1073741831"/>
+            <wp:cNvGraphicFramePr>
+              <a:graphicFrameLocks xmlns:a="http://schemas.openxmlformats.org/drawingml/2006/main" noChangeAspect="1"/>
+            </wp:cNvGraphicFramePr>
+            <a:graphic xmlns:a="http://schemas.openxmlformats.org/drawingml/2006/main">
+              <a:graphicData uri="http://schemas.openxmlformats.org/drawingml/2006/picture">
+                <pic:pic xmlns:pic="http://schemas.openxmlformats.org/drawingml/2006/picture">
+                  <pic:nvPicPr>
+                    <pic:cNvPr id="0" name="Тесты Задача 3.png"/>
+                    <pic:cNvPicPr/>
+                  </pic:nvPicPr>
+                  <pic:blipFill>
+                    <a:blip r:embed="rId12"/>
+                    <a:stretch>
+                      <a:fillRect/>
+                    </a:stretch>
+                  </pic:blipFill>
+                  <pic:spPr>
+                    <a:xfrm>
+                      <a:off x="0" y="0"/>
+                      <a:ext cx="5940000" cy="846412"/>
+                    </a:xfrm>
+                    <a:prstGeom prst="rect">
+                      <a:avLst/>
+                    </a:prstGeom>
+                  </pic:spPr>
+                </pic:pic>
+              </a:graphicData>
+            </a:graphic>
+          </wp:inline>
+        </w:drawing>
+      </w:r>
+    </w:p>
+    <w:p>
+      <w:pPr>
+        <w:pStyle w:val="BodyA"/>
+        <w:widowControl w:val="0"/>
+        <w:spacing w:after="80"/>
+        <w:ind w:left="108" w:hanging="108"/>
+        <w:jc w:val="center"/>
+      </w:pPr>
+    </w:p>
+    <w:p>
+      <w:pPr>
+        <w:pStyle w:val="BodyA"/>
+        <w:widowControl w:val="0"/>
+        <w:spacing w:after="80"/>
+        <w:jc w:val="center"/>
+      </w:pPr>
+    </w:p>
+    <w:p>
+      <w:pPr>
+        <w:pStyle w:val="BodyA"/>
+        <w:spacing w:after="120"/>
+      </w:pPr>
+    </w:p>
+    <w:p>
+      <w:pPr>
+        <w:pStyle w:val="BodyA"/>
+        <w:spacing w:after="80" w:line="360" w:lineRule="auto"/>
+        <w:jc w:val="both"/>
+        <w:rPr>
+          <w:lang w:val="ru-RU"/>
+        </w:rPr>
+      </w:pPr>
+      <w:r>
+        <w:rPr>
+          <w:b/>
+          <w:bCs/>
+          <w:sz w:val="26"/>
+          <w:szCs w:val="26"/>
+          <w:lang w:val="ru-RU"/>
+        </w:rPr>
+        <w:t xml:space="preserve">Чёрный ящик.</w:t>
       </w:r>
     </w:p>
     <w:p>
@@ -3558,46 +3531,15 @@
           <w:szCs w:val="26"/>
           <w:lang w:val="ru-RU"/>
         </w:rPr>
-        <w:t>Для проверки работоспособности программы составлено 19 тестов (</w:t>
-      </w:r>
-      <w:r>
-        <w:rPr>
-          <w:sz w:val="26"/>
-          <w:szCs w:val="26"/>
-        </w:rPr>
-        <w:t>T</w:t>
-      </w:r>
-      <w:r>
-        <w:rPr>
-          <w:sz w:val="26"/>
-          <w:szCs w:val="26"/>
-          <w:lang w:val="ru-RU"/>
-        </w:rPr>
-        <w:t>01–</w:t>
-      </w:r>
-      <w:r>
-        <w:rPr>
-          <w:sz w:val="26"/>
-          <w:szCs w:val="26"/>
-        </w:rPr>
-        <w:t>T</w:t>
-      </w:r>
-      <w:r>
-        <w:rPr>
-          <w:sz w:val="26"/>
-          <w:szCs w:val="26"/>
-          <w:lang w:val="ru-RU"/>
-        </w:rPr>
-        <w:t>19), покрывающих все три задачи варианта 22. Ниже приведены таблица тестов и две матрицы покрытия — по критериям чёрного и белого ящика, — оформленные по образцу таблицы тестов, предоставленной для лабораторной работы №1.</w:t>
-      </w:r>
-    </w:p>
-    <w:p>
-      <w:pPr>
-        <w:pStyle w:val="BodyA"/>
-        <w:spacing w:after="80" w:line="360" w:lineRule="auto"/>
+        <w:t>Матрицы показывают, какие классы входных и выходных данных покрывает каждый тест (без анализа внутреннего кода).</w:t>
+      </w:r>
+    </w:p>
+    <w:p>
+      <w:pPr>
+        <w:pStyle w:val="BodyA"/>
+        <w:spacing w:after="40" w:line="360" w:lineRule="auto"/>
         <w:jc w:val="both"/>
       </w:pPr>
-      <w:proofErr w:type="spellStart"/>
       <w:r>
         <w:rPr>
           <w:b/>
@@ -3605,19 +3547,93 @@
           <w:sz w:val="26"/>
           <w:szCs w:val="26"/>
         </w:rPr>
-        <w:t>Таблица</w:t>
-      </w:r>
-      <w:proofErr w:type="spellEnd"/>
+        <w:t xml:space="preserve">Задача </w:t>
+      </w:r>
       <w:r>
         <w:rPr>
           <w:b/>
           <w:bCs/>
           <w:sz w:val="26"/>
           <w:szCs w:val="26"/>
-        </w:rPr>
-        <w:t xml:space="preserve"> </w:t>
-      </w:r>
-      <w:proofErr w:type="spellStart"/>
+          <w:lang w:val="ru-RU"/>
+        </w:rPr>
+        <w:t>1:</w:t>
+      </w:r>
+    </w:p>
+    <w:p>
+      <w:pPr>
+        <w:jc w:val="center"/>
+      </w:pPr>
+      <w:r>
+        <w:rPr>
+          <w:noProof/>
+        </w:rPr>
+        <w:drawing>
+          <wp:inline distT="0" distB="0" distL="0" distR="0" wp14:anchorId="5CC9F130" wp14:editId="4A3694AE">
+            <wp:extent cx="5940000" cy="1102785"/>
+            <wp:effectExtent l="0" t="0" r="0" b="0"/>
+            <wp:docPr id="1073741832" name="Picture 1073741832"/>
+            <wp:cNvGraphicFramePr>
+              <a:graphicFrameLocks xmlns:a="http://schemas.openxmlformats.org/drawingml/2006/main" noChangeAspect="1"/>
+            </wp:cNvGraphicFramePr>
+            <a:graphic xmlns:a="http://schemas.openxmlformats.org/drawingml/2006/main">
+              <a:graphicData uri="http://schemas.openxmlformats.org/drawingml/2006/picture">
+                <pic:pic xmlns:pic="http://schemas.openxmlformats.org/drawingml/2006/picture">
+                  <pic:nvPicPr>
+                    <pic:cNvPr id="0" name="ЧЯ Задача 1.png"/>
+                    <pic:cNvPicPr/>
+                  </pic:nvPicPr>
+                  <pic:blipFill>
+                    <a:blip r:embed="rId13"/>
+                    <a:stretch>
+                      <a:fillRect/>
+                    </a:stretch>
+                  </pic:blipFill>
+                  <pic:spPr>
+                    <a:xfrm>
+                      <a:off x="0" y="0"/>
+                      <a:ext cx="5940000" cy="1102785"/>
+                    </a:xfrm>
+                    <a:prstGeom prst="rect">
+                      <a:avLst/>
+                    </a:prstGeom>
+                  </pic:spPr>
+                </pic:pic>
+              </a:graphicData>
+            </a:graphic>
+          </wp:inline>
+        </w:drawing>
+      </w:r>
+    </w:p>
+    <w:p>
+      <w:pPr>
+        <w:pStyle w:val="BodyA"/>
+        <w:widowControl w:val="0"/>
+        <w:spacing w:after="40"/>
+        <w:ind w:left="108" w:hanging="108"/>
+        <w:jc w:val="center"/>
+      </w:pPr>
+    </w:p>
+    <w:p>
+      <w:pPr>
+        <w:pStyle w:val="BodyA"/>
+        <w:widowControl w:val="0"/>
+        <w:spacing w:after="40"/>
+        <w:jc w:val="center"/>
+      </w:pPr>
+    </w:p>
+    <w:p>
+      <w:pPr>
+        <w:pStyle w:val="BodyA"/>
+        <w:spacing w:after="120"/>
+      </w:pPr>
+    </w:p>
+    <w:p>
+      <w:pPr>
+        <w:pStyle w:val="BodyA"/>
+        <w:spacing w:after="40" w:line="360" w:lineRule="auto"/>
+        <w:jc w:val="both"/>
+      </w:pPr>
       <w:r>
         <w:rPr>
           <w:b/>
@@ -3625,37 +3641,7 @@
           <w:sz w:val="26"/>
           <w:szCs w:val="26"/>
         </w:rPr>
-        <w:t>тестов</w:t>
-      </w:r>
-      <w:proofErr w:type="spellEnd"/>
-      <w:r>
-        <w:rPr>
-          <w:b/>
-          <w:bCs/>
-          <w:sz w:val="26"/>
-          <w:szCs w:val="26"/>
-        </w:rPr>
-        <w:t xml:space="preserve"> — </w:t>
-      </w:r>
-      <w:proofErr w:type="spellStart"/>
-      <w:r>
-        <w:rPr>
-          <w:b/>
-          <w:bCs/>
-          <w:sz w:val="26"/>
-          <w:szCs w:val="26"/>
-        </w:rPr>
-        <w:t>Задача</w:t>
-      </w:r>
-      <w:proofErr w:type="spellEnd"/>
-      <w:r>
-        <w:rPr>
-          <w:b/>
-          <w:bCs/>
-          <w:sz w:val="26"/>
-          <w:szCs w:val="26"/>
-        </w:rPr>
-        <w:t xml:space="preserve"> 1.</w:t>
+        <w:t xml:space="preserve">Задача 2:</w:t>
       </w:r>
     </w:p>
     <w:p>
@@ -3663,18 +3649,22 @@
         <w:jc w:val="center"/>
       </w:pPr>
       <w:r>
+        <w:rPr>
+          <w:noProof/>
+        </w:rPr>
         <w:drawing>
-          <wp:inline xmlns:a="http://schemas.openxmlformats.org/drawingml/2006/main" xmlns:pic="http://schemas.openxmlformats.org/drawingml/2006/picture">
-            <wp:extent cx="5940000" cy="3093092"/>
-            <wp:docPr id="1073741829" name="Picture 1073741829"/>
+          <wp:inline distT="0" distB="0" distL="0" distR="0" wp14:anchorId="2AF2B3AD" wp14:editId="3BE3ACDE">
+            <wp:extent cx="5940000" cy="780254"/>
+            <wp:effectExtent l="0" t="0" r="0" b="0"/>
+            <wp:docPr id="1073741833" name="Picture 1073741833"/>
             <wp:cNvGraphicFramePr>
-              <a:graphicFrameLocks noChangeAspect="1"/>
+              <a:graphicFrameLocks xmlns:a="http://schemas.openxmlformats.org/drawingml/2006/main" noChangeAspect="1"/>
             </wp:cNvGraphicFramePr>
-            <a:graphic>
+            <a:graphic xmlns:a="http://schemas.openxmlformats.org/drawingml/2006/main">
               <a:graphicData uri="http://schemas.openxmlformats.org/drawingml/2006/picture">
-                <pic:pic>
+                <pic:pic xmlns:pic="http://schemas.openxmlformats.org/drawingml/2006/picture">
                   <pic:nvPicPr>
-                    <pic:cNvPr id="0" name="Тесты Задача 1.png"/>
+                    <pic:cNvPr id="0" name="ЧЯ Задача 2.png"/>
                     <pic:cNvPicPr/>
                   </pic:nvPicPr>
                   <pic:blipFill>
@@ -3686,9 +3676,11 @@
                   <pic:spPr>
                     <a:xfrm>
                       <a:off x="0" y="0"/>
-                      <a:ext cx="5940000" cy="3093092"/>
+                      <a:ext cx="5940000" cy="780254"/>
                     </a:xfrm>
-                    <a:prstGeom prst="rect"/>
+                    <a:prstGeom prst="rect">
+                      <a:avLst/>
+                    </a:prstGeom>
                   </pic:spPr>
                 </pic:pic>
               </a:graphicData>
@@ -3701,42 +3693,30 @@
       <w:pPr>
         <w:pStyle w:val="BodyA"/>
         <w:widowControl w:val="0"/>
-        <w:spacing w:after="80"/>
+        <w:spacing w:after="40"/>
         <w:ind w:left="108" w:hanging="108"/>
         <w:jc w:val="center"/>
-        <w:rPr>
-          <w:lang w:val="ru-RU"/>
-        </w:rPr>
       </w:pPr>
     </w:p>
     <w:p>
       <w:pPr>
         <w:pStyle w:val="BodyA"/>
         <w:widowControl w:val="0"/>
-        <w:spacing w:after="80"/>
+        <w:spacing w:after="40"/>
         <w:jc w:val="center"/>
-        <w:rPr>
-          <w:lang w:val="ru-RU"/>
-        </w:rPr>
       </w:pPr>
     </w:p>
     <w:p>
       <w:pPr>
         <w:pStyle w:val="BodyA"/>
         <w:spacing w:after="120"/>
-        <w:rPr>
-          <w:lang w:val="ru-RU"/>
-        </w:rPr>
-      </w:pPr>
-    </w:p>
-    <w:p>
-      <w:pPr>
-        <w:pStyle w:val="BodyA"/>
-        <w:spacing w:after="80" w:line="360" w:lineRule="auto"/>
+      </w:pPr>
+    </w:p>
+    <w:p>
+      <w:pPr>
+        <w:pStyle w:val="BodyA"/>
+        <w:spacing w:after="40" w:line="360" w:lineRule="auto"/>
         <w:jc w:val="both"/>
-        <w:rPr>
-          <w:lang w:val="ru-RU"/>
-        </w:rPr>
       </w:pPr>
       <w:r>
         <w:rPr>
@@ -3744,9 +3724,8 @@
           <w:bCs/>
           <w:sz w:val="26"/>
           <w:szCs w:val="26"/>
-          <w:lang w:val="ru-RU"/>
-        </w:rPr>
-        <w:t xml:space="preserve">Таблица тестов — Задача 2. Тесты </w:t>
+        </w:rPr>
+        <w:t xml:space="preserve">Задача </w:t>
       </w:r>
       <w:r>
         <w:rPr>
@@ -3754,37 +3733,9 @@
           <w:bCs/>
           <w:sz w:val="26"/>
           <w:szCs w:val="26"/>
-        </w:rPr>
-        <w:t>T</w:t>
-      </w:r>
-      <w:r>
-        <w:rPr>
-          <w:b/>
-          <w:bCs/>
-          <w:sz w:val="26"/>
-          <w:szCs w:val="26"/>
-          <w:lang w:val="ru-RU"/>
-        </w:rPr>
-        <w:t>15–</w:t>
-      </w:r>
-      <w:r>
-        <w:rPr>
-          <w:b/>
-          <w:bCs/>
-          <w:sz w:val="26"/>
-          <w:szCs w:val="26"/>
-        </w:rPr>
-        <w:t>T</w:t>
-      </w:r>
-      <w:r>
-        <w:rPr>
-          <w:b/>
-          <w:bCs/>
-          <w:sz w:val="26"/>
-          <w:szCs w:val="26"/>
-          <w:lang w:val="ru-RU"/>
-        </w:rPr>
-        <w:t>18 подобраны так, чтобы в каждом из них нарушалось ровно одно из четырёх условий конъюнкции, а не все сразу.</w:t>
+          <w:lang w:val="ru-RU"/>
+        </w:rPr>
+        <w:t>3:</w:t>
       </w:r>
     </w:p>
     <w:p>
@@ -3792,18 +3743,22 @@
         <w:jc w:val="center"/>
       </w:pPr>
       <w:r>
+        <w:rPr>
+          <w:noProof/>
+        </w:rPr>
         <w:drawing>
-          <wp:inline xmlns:a="http://schemas.openxmlformats.org/drawingml/2006/main" xmlns:pic="http://schemas.openxmlformats.org/drawingml/2006/picture">
-            <wp:extent cx="5940000" cy="2506043"/>
-            <wp:docPr id="1073741830" name="Picture 1073741830"/>
+          <wp:inline distT="0" distB="0" distL="0" distR="0" wp14:anchorId="286BA341" wp14:editId="4462CFF3">
+            <wp:extent cx="5400675" cy="1352550"/>
+            <wp:effectExtent l="0" t="0" r="0" b="0"/>
+            <wp:docPr id="1073741834" name="Picture 1073741834"/>
             <wp:cNvGraphicFramePr>
-              <a:graphicFrameLocks noChangeAspect="1"/>
+              <a:graphicFrameLocks xmlns:a="http://schemas.openxmlformats.org/drawingml/2006/main" noChangeAspect="1"/>
             </wp:cNvGraphicFramePr>
-            <a:graphic>
+            <a:graphic xmlns:a="http://schemas.openxmlformats.org/drawingml/2006/main">
               <a:graphicData uri="http://schemas.openxmlformats.org/drawingml/2006/picture">
-                <pic:pic>
+                <pic:pic xmlns:pic="http://schemas.openxmlformats.org/drawingml/2006/picture">
                   <pic:nvPicPr>
-                    <pic:cNvPr id="0" name="Тесты Задача 2.png"/>
+                    <pic:cNvPr id="0" name="ЧЯ Задача 3.png"/>
                     <pic:cNvPicPr/>
                   </pic:nvPicPr>
                   <pic:blipFill>
@@ -3815,9 +3770,11 @@
                   <pic:spPr>
                     <a:xfrm>
                       <a:off x="0" y="0"/>
-                      <a:ext cx="5940000" cy="2506043"/>
+                      <a:ext cx="5400675" cy="1352550"/>
                     </a:xfrm>
-                    <a:prstGeom prst="rect"/>
+                    <a:prstGeom prst="rect">
+                      <a:avLst/>
+                    </a:prstGeom>
                   </pic:spPr>
                 </pic:pic>
               </a:graphicData>
@@ -3830,7 +3787,7 @@
       <w:pPr>
         <w:pStyle w:val="BodyA"/>
         <w:widowControl w:val="0"/>
-        <w:spacing w:after="80"/>
+        <w:spacing w:after="40"/>
         <w:ind w:left="108" w:hanging="108"/>
         <w:jc w:val="center"/>
       </w:pPr>
@@ -3839,7 +3796,7 @@
       <w:pPr>
         <w:pStyle w:val="BodyA"/>
         <w:widowControl w:val="0"/>
-        <w:spacing w:after="80"/>
+        <w:spacing w:after="40"/>
         <w:jc w:val="center"/>
       </w:pPr>
     </w:p>
@@ -3854,18 +3811,45 @@
         <w:pStyle w:val="BodyA"/>
         <w:spacing w:after="80" w:line="360" w:lineRule="auto"/>
         <w:jc w:val="both"/>
-      </w:pPr>
-      <w:proofErr w:type="spellStart"/>
+        <w:rPr>
+          <w:lang w:val="ru-RU"/>
+        </w:rPr>
+      </w:pPr>
       <w:r>
         <w:rPr>
           <w:b/>
           <w:bCs/>
           <w:sz w:val="26"/>
           <w:szCs w:val="26"/>
-        </w:rPr>
-        <w:t>Таблица</w:t>
-      </w:r>
-      <w:proofErr w:type="spellEnd"/>
+          <w:lang w:val="ru-RU"/>
+        </w:rPr>
+        <w:t>Белый ящик.</w:t>
+      </w:r>
+    </w:p>
+    <w:p>
+      <w:pPr>
+        <w:pStyle w:val="BodyA"/>
+        <w:spacing w:after="120" w:line="360" w:lineRule="auto"/>
+        <w:jc w:val="both"/>
+        <w:rPr>
+          <w:lang w:val="ru-RU"/>
+        </w:rPr>
+      </w:pPr>
+      <w:r>
+        <w:rPr>
+          <w:sz w:val="26"/>
+          <w:szCs w:val="26"/>
+          <w:lang w:val="ru-RU"/>
+        </w:rPr>
+        <w:t>Матрицы показывают, какие ветки и условия кода выполнялись в каждом тесте.</w:t>
+      </w:r>
+    </w:p>
+    <w:p>
+      <w:pPr>
+        <w:pStyle w:val="BodyA"/>
+        <w:spacing w:after="40" w:line="360" w:lineRule="auto"/>
+        <w:jc w:val="both"/>
+      </w:pPr>
       <w:r>
         <w:rPr>
           <w:b/>
@@ -3873,47 +3857,17 @@
           <w:sz w:val="26"/>
           <w:szCs w:val="26"/>
         </w:rPr>
-        <w:t xml:space="preserve"> </w:t>
-      </w:r>
-      <w:proofErr w:type="spellStart"/>
+        <w:t xml:space="preserve">Задача </w:t>
+      </w:r>
       <w:r>
         <w:rPr>
           <w:b/>
           <w:bCs/>
           <w:sz w:val="26"/>
           <w:szCs w:val="26"/>
-        </w:rPr>
-        <w:t>тестов</w:t>
-      </w:r>
-      <w:proofErr w:type="spellEnd"/>
-      <w:r>
-        <w:rPr>
-          <w:b/>
-          <w:bCs/>
-          <w:sz w:val="26"/>
-          <w:szCs w:val="26"/>
-        </w:rPr>
-        <w:t xml:space="preserve"> — </w:t>
-      </w:r>
-      <w:proofErr w:type="spellStart"/>
-      <w:r>
-        <w:rPr>
-          <w:b/>
-          <w:bCs/>
-          <w:sz w:val="26"/>
-          <w:szCs w:val="26"/>
-        </w:rPr>
-        <w:t>Задача</w:t>
-      </w:r>
-      <w:proofErr w:type="spellEnd"/>
-      <w:r>
-        <w:rPr>
-          <w:b/>
-          <w:bCs/>
-          <w:sz w:val="26"/>
-          <w:szCs w:val="26"/>
-        </w:rPr>
-        <w:t xml:space="preserve"> 3.</w:t>
+          <w:lang w:val="ru-RU"/>
+        </w:rPr>
+        <w:t>1:</w:t>
       </w:r>
     </w:p>
     <w:p>
@@ -3921,18 +3875,22 @@
         <w:jc w:val="center"/>
       </w:pPr>
       <w:r>
+        <w:rPr>
+          <w:noProof/>
+        </w:rPr>
         <w:drawing>
-          <wp:inline xmlns:a="http://schemas.openxmlformats.org/drawingml/2006/main" xmlns:pic="http://schemas.openxmlformats.org/drawingml/2006/picture">
-            <wp:extent cx="5940000" cy="846412"/>
-            <wp:docPr id="1073741831" name="Picture 1073741831"/>
+          <wp:inline distT="0" distB="0" distL="0" distR="0" wp14:anchorId="1DD0873A" wp14:editId="63E08FC3">
+            <wp:extent cx="5940000" cy="964174"/>
+            <wp:effectExtent l="0" t="0" r="0" b="0"/>
+            <wp:docPr id="1073741835" name="Picture 1073741835"/>
             <wp:cNvGraphicFramePr>
-              <a:graphicFrameLocks noChangeAspect="1"/>
+              <a:graphicFrameLocks xmlns:a="http://schemas.openxmlformats.org/drawingml/2006/main" noChangeAspect="1"/>
             </wp:cNvGraphicFramePr>
-            <a:graphic>
+            <a:graphic xmlns:a="http://schemas.openxmlformats.org/drawingml/2006/main">
               <a:graphicData uri="http://schemas.openxmlformats.org/drawingml/2006/picture">
-                <pic:pic>
+                <pic:pic xmlns:pic="http://schemas.openxmlformats.org/drawingml/2006/picture">
                   <pic:nvPicPr>
-                    <pic:cNvPr id="0" name="Тесты Задача 3.png"/>
+                    <pic:cNvPr id="0" name="БЯ Задача 1.png"/>
                     <pic:cNvPicPr/>
                   </pic:nvPicPr>
                   <pic:blipFill>
@@ -3944,9 +3902,11 @@
                   <pic:spPr>
                     <a:xfrm>
                       <a:off x="0" y="0"/>
-                      <a:ext cx="5940000" cy="846412"/>
+                      <a:ext cx="5940000" cy="964174"/>
                     </a:xfrm>
-                    <a:prstGeom prst="rect"/>
+                    <a:prstGeom prst="rect">
+                      <a:avLst/>
+                    </a:prstGeom>
                   </pic:spPr>
                 </pic:pic>
               </a:graphicData>
@@ -3959,7 +3919,7 @@
       <w:pPr>
         <w:pStyle w:val="BodyA"/>
         <w:widowControl w:val="0"/>
-        <w:spacing w:after="80"/>
+        <w:spacing w:after="40"/>
         <w:ind w:left="108" w:hanging="108"/>
         <w:jc w:val="center"/>
       </w:pPr>
@@ -3968,7 +3928,7 @@
       <w:pPr>
         <w:pStyle w:val="BodyA"/>
         <w:widowControl w:val="0"/>
-        <w:spacing w:after="80"/>
+        <w:spacing w:after="40"/>
         <w:jc w:val="center"/>
       </w:pPr>
     </w:p>
@@ -3981,20 +3941,22 @@
     <w:p>
       <w:pPr>
         <w:pStyle w:val="BodyA"/>
-        <w:spacing w:after="80" w:line="360" w:lineRule="auto"/>
+        <w:spacing w:after="40" w:line="360" w:lineRule="auto"/>
         <w:jc w:val="both"/>
-      </w:pPr>
-      <w:proofErr w:type="spellStart"/>
+        <w:rPr>
+          <w:lang w:val="ru-RU"/>
+        </w:rPr>
+      </w:pPr>
       <w:r>
         <w:rPr>
           <w:b/>
           <w:bCs/>
           <w:sz w:val="26"/>
           <w:szCs w:val="26"/>
-        </w:rPr>
-        <w:t>Чёрный</w:t>
-      </w:r>
-      <w:proofErr w:type="spellEnd"/>
+          <w:lang w:val="ru-RU"/>
+        </w:rPr>
+        <w:t xml:space="preserve">Задача 2 (условия конъюнкции </w:t>
+      </w:r>
       <w:r>
         <w:rPr>
           <w:b/>
@@ -4002,19 +3964,18 @@
           <w:sz w:val="26"/>
           <w:szCs w:val="26"/>
         </w:rPr>
-        <w:t xml:space="preserve"> </w:t>
-      </w:r>
-      <w:proofErr w:type="spellStart"/>
+        <w:t>inside</w:t>
+      </w:r>
       <w:r>
         <w:rPr>
           <w:b/>
           <w:bCs/>
           <w:sz w:val="26"/>
           <w:szCs w:val="26"/>
-        </w:rPr>
-        <w:t>ящик</w:t>
-      </w:r>
-      <w:proofErr w:type="spellEnd"/>
+          <w:lang w:val="ru-RU"/>
+        </w:rPr>
+        <w:t xml:space="preserve"> = </w:t>
+      </w:r>
       <w:r>
         <w:rPr>
           <w:b/>
@@ -4022,45 +3983,18 @@
           <w:sz w:val="26"/>
           <w:szCs w:val="26"/>
         </w:rPr>
-        <w:t>.</w:t>
-      </w:r>
-    </w:p>
-    <w:p>
-      <w:pPr>
-        <w:pStyle w:val="BodyA"/>
-        <w:spacing w:after="120" w:line="360" w:lineRule="auto"/>
-        <w:jc w:val="both"/>
-        <w:rPr>
-          <w:lang w:val="ru-RU"/>
-        </w:rPr>
-      </w:pPr>
-      <w:r>
-        <w:rPr>
-          <w:sz w:val="26"/>
-          <w:szCs w:val="26"/>
-          <w:lang w:val="ru-RU"/>
-        </w:rPr>
-        <w:lastRenderedPageBreak/>
-        <w:t>Матрицы показывают, какие классы входных и выходных данных покрывает каждый тест (без анализа внутреннего кода).</w:t>
-      </w:r>
-    </w:p>
-    <w:p>
-      <w:pPr>
-        <w:pStyle w:val="BodyA"/>
-        <w:spacing w:after="40" w:line="360" w:lineRule="auto"/>
-        <w:jc w:val="both"/>
-      </w:pPr>
-      <w:proofErr w:type="spellStart"/>
+        <w:t>c</w:t>
+      </w:r>
       <w:r>
         <w:rPr>
           <w:b/>
           <w:bCs/>
           <w:sz w:val="26"/>
           <w:szCs w:val="26"/>
-        </w:rPr>
-        <w:t>Задача</w:t>
-      </w:r>
-      <w:proofErr w:type="spellEnd"/>
+          <w:lang w:val="ru-RU"/>
+        </w:rPr>
+        <w:t xml:space="preserve">1 &amp;&amp; </w:t>
+      </w:r>
       <w:r>
         <w:rPr>
           <w:b/>
@@ -4068,7 +4002,7 @@
           <w:sz w:val="26"/>
           <w:szCs w:val="26"/>
         </w:rPr>
-        <w:t xml:space="preserve"> </w:t>
+        <w:t>c</w:t>
       </w:r>
       <w:r>
         <w:rPr>
@@ -4078,7 +4012,45 @@
           <w:szCs w:val="26"/>
           <w:lang w:val="ru-RU"/>
         </w:rPr>
-        <w:t>1:</w:t>
+        <w:t xml:space="preserve">2 &amp;&amp; </w:t>
+      </w:r>
+      <w:r>
+        <w:rPr>
+          <w:b/>
+          <w:bCs/>
+          <w:sz w:val="26"/>
+          <w:szCs w:val="26"/>
+        </w:rPr>
+        <w:t>c</w:t>
+      </w:r>
+      <w:r>
+        <w:rPr>
+          <w:b/>
+          <w:bCs/>
+          <w:sz w:val="26"/>
+          <w:szCs w:val="26"/>
+          <w:lang w:val="ru-RU"/>
+        </w:rPr>
+        <w:t xml:space="preserve">3 &amp;&amp; </w:t>
+      </w:r>
+      <w:r>
+        <w:rPr>
+          <w:b/>
+          <w:bCs/>
+          <w:sz w:val="26"/>
+          <w:szCs w:val="26"/>
+        </w:rPr>
+        <w:t>c</w:t>
+      </w:r>
+      <w:r>
+        <w:rPr>
+          <w:b/>
+          <w:bCs/>
+          <w:sz w:val="26"/>
+          <w:szCs w:val="26"/>
+          <w:lang w:val="ru-RU"/>
+        </w:rPr>
+        <w:t>4):</w:t>
       </w:r>
     </w:p>
     <w:p>
@@ -4086,18 +4058,22 @@
         <w:jc w:val="center"/>
       </w:pPr>
       <w:r>
+        <w:rPr>
+          <w:noProof/>
+        </w:rPr>
         <w:drawing>
-          <wp:inline xmlns:a="http://schemas.openxmlformats.org/drawingml/2006/main" xmlns:pic="http://schemas.openxmlformats.org/drawingml/2006/picture">
-            <wp:extent cx="5940000" cy="1102785"/>
-            <wp:docPr id="1073741832" name="Picture 1073741832"/>
+          <wp:inline distT="0" distB="0" distL="0" distR="0" wp14:anchorId="38F827EC" wp14:editId="23205AC8">
+            <wp:extent cx="5940000" cy="2454085"/>
+            <wp:effectExtent l="0" t="0" r="0" b="0"/>
+            <wp:docPr id="1073741836" name="Picture 1073741836"/>
             <wp:cNvGraphicFramePr>
-              <a:graphicFrameLocks noChangeAspect="1"/>
+              <a:graphicFrameLocks xmlns:a="http://schemas.openxmlformats.org/drawingml/2006/main" noChangeAspect="1"/>
             </wp:cNvGraphicFramePr>
-            <a:graphic>
+            <a:graphic xmlns:a="http://schemas.openxmlformats.org/drawingml/2006/main">
               <a:graphicData uri="http://schemas.openxmlformats.org/drawingml/2006/picture">
-                <pic:pic>
+                <pic:pic xmlns:pic="http://schemas.openxmlformats.org/drawingml/2006/picture">
                   <pic:nvPicPr>
-                    <pic:cNvPr id="0" name="ЧЯ Задача 1.png"/>
+                    <pic:cNvPr id="0" name="БЯ Задача 2.png"/>
                     <pic:cNvPicPr/>
                   </pic:nvPicPr>
                   <pic:blipFill>
@@ -4109,9 +4085,11 @@
                   <pic:spPr>
                     <a:xfrm>
                       <a:off x="0" y="0"/>
-                      <a:ext cx="5940000" cy="1102785"/>
+                      <a:ext cx="5940000" cy="2454085"/>
                     </a:xfrm>
-                    <a:prstGeom prst="rect"/>
+                    <a:prstGeom prst="rect">
+                      <a:avLst/>
+                    </a:prstGeom>
                   </pic:spPr>
                 </pic:pic>
               </a:graphicData>
@@ -4146,241 +4124,6 @@
     <w:p>
       <w:pPr>
         <w:pStyle w:val="BodyA"/>
-        <w:spacing w:after="40" w:line="360" w:lineRule="auto"/>
-        <w:jc w:val="both"/>
-      </w:pPr>
-      <w:proofErr w:type="spellStart"/>
-      <w:r>
-        <w:rPr>
-          <w:b/>
-          <w:bCs/>
-          <w:sz w:val="26"/>
-          <w:szCs w:val="26"/>
-        </w:rPr>
-        <w:t>Задача</w:t>
-      </w:r>
-      <w:proofErr w:type="spellEnd"/>
-      <w:r>
-        <w:rPr>
-          <w:b/>
-          <w:bCs/>
-          <w:sz w:val="26"/>
-          <w:szCs w:val="26"/>
-        </w:rPr>
-        <w:t xml:space="preserve"> 2:</w:t>
-      </w:r>
-    </w:p>
-    <w:p>
-      <w:pPr>
-        <w:jc w:val="center"/>
-      </w:pPr>
-      <w:r>
-        <w:drawing>
-          <wp:inline xmlns:a="http://schemas.openxmlformats.org/drawingml/2006/main" xmlns:pic="http://schemas.openxmlformats.org/drawingml/2006/picture">
-            <wp:extent cx="5940000" cy="780254"/>
-            <wp:docPr id="1073741833" name="Picture 1073741833"/>
-            <wp:cNvGraphicFramePr>
-              <a:graphicFrameLocks noChangeAspect="1"/>
-            </wp:cNvGraphicFramePr>
-            <a:graphic>
-              <a:graphicData uri="http://schemas.openxmlformats.org/drawingml/2006/picture">
-                <pic:pic>
-                  <pic:nvPicPr>
-                    <pic:cNvPr id="0" name="ЧЯ Задача 2.png"/>
-                    <pic:cNvPicPr/>
-                  </pic:nvPicPr>
-                  <pic:blipFill>
-                    <a:blip r:embed="rId18"/>
-                    <a:stretch>
-                      <a:fillRect/>
-                    </a:stretch>
-                  </pic:blipFill>
-                  <pic:spPr>
-                    <a:xfrm>
-                      <a:off x="0" y="0"/>
-                      <a:ext cx="5940000" cy="780254"/>
-                    </a:xfrm>
-                    <a:prstGeom prst="rect"/>
-                  </pic:spPr>
-                </pic:pic>
-              </a:graphicData>
-            </a:graphic>
-          </wp:inline>
-        </w:drawing>
-      </w:r>
-    </w:p>
-    <w:p>
-      <w:pPr>
-        <w:pStyle w:val="BodyA"/>
-        <w:widowControl w:val="0"/>
-        <w:spacing w:after="40"/>
-        <w:ind w:left="108" w:hanging="108"/>
-        <w:jc w:val="center"/>
-      </w:pPr>
-    </w:p>
-    <w:p>
-      <w:pPr>
-        <w:pStyle w:val="BodyA"/>
-        <w:widowControl w:val="0"/>
-        <w:spacing w:after="40"/>
-        <w:jc w:val="center"/>
-      </w:pPr>
-    </w:p>
-    <w:p>
-      <w:pPr>
-        <w:pStyle w:val="BodyA"/>
-        <w:spacing w:after="120"/>
-      </w:pPr>
-    </w:p>
-    <w:p>
-      <w:pPr>
-        <w:pStyle w:val="BodyA"/>
-        <w:spacing w:after="40" w:line="360" w:lineRule="auto"/>
-        <w:jc w:val="both"/>
-      </w:pPr>
-      <w:proofErr w:type="spellStart"/>
-      <w:r>
-        <w:rPr>
-          <w:b/>
-          <w:bCs/>
-          <w:sz w:val="26"/>
-          <w:szCs w:val="26"/>
-        </w:rPr>
-        <w:t>Задача</w:t>
-      </w:r>
-      <w:proofErr w:type="spellEnd"/>
-      <w:r>
-        <w:rPr>
-          <w:b/>
-          <w:bCs/>
-          <w:sz w:val="26"/>
-          <w:szCs w:val="26"/>
-        </w:rPr>
-        <w:t xml:space="preserve"> </w:t>
-      </w:r>
-      <w:r>
-        <w:rPr>
-          <w:b/>
-          <w:bCs/>
-          <w:sz w:val="26"/>
-          <w:szCs w:val="26"/>
-          <w:lang w:val="ru-RU"/>
-        </w:rPr>
-        <w:t>3:</w:t>
-      </w:r>
-    </w:p>
-    <w:p>
-      <w:pPr>
-        <w:jc w:val="center"/>
-      </w:pPr>
-      <w:r>
-        <w:drawing>
-          <wp:inline xmlns:a="http://schemas.openxmlformats.org/drawingml/2006/main" xmlns:pic="http://schemas.openxmlformats.org/drawingml/2006/picture">
-            <wp:extent cx="5400675" cy="1352550"/>
-            <wp:docPr id="1073741834" name="Picture 1073741834"/>
-            <wp:cNvGraphicFramePr>
-              <a:graphicFrameLocks noChangeAspect="1"/>
-            </wp:cNvGraphicFramePr>
-            <a:graphic>
-              <a:graphicData uri="http://schemas.openxmlformats.org/drawingml/2006/picture">
-                <pic:pic>
-                  <pic:nvPicPr>
-                    <pic:cNvPr id="0" name="ЧЯ Задача 3.png"/>
-                    <pic:cNvPicPr/>
-                  </pic:nvPicPr>
-                  <pic:blipFill>
-                    <a:blip r:embed="rId19"/>
-                    <a:stretch>
-                      <a:fillRect/>
-                    </a:stretch>
-                  </pic:blipFill>
-                  <pic:spPr>
-                    <a:xfrm>
-                      <a:off x="0" y="0"/>
-                      <a:ext cx="5400675" cy="1352550"/>
-                    </a:xfrm>
-                    <a:prstGeom prst="rect"/>
-                  </pic:spPr>
-                </pic:pic>
-              </a:graphicData>
-            </a:graphic>
-          </wp:inline>
-        </w:drawing>
-      </w:r>
-    </w:p>
-    <w:p>
-      <w:pPr>
-        <w:pStyle w:val="BodyA"/>
-        <w:widowControl w:val="0"/>
-        <w:spacing w:after="40"/>
-        <w:ind w:left="108" w:hanging="108"/>
-        <w:jc w:val="center"/>
-      </w:pPr>
-    </w:p>
-    <w:p>
-      <w:pPr>
-        <w:pStyle w:val="BodyA"/>
-        <w:widowControl w:val="0"/>
-        <w:spacing w:after="40"/>
-        <w:jc w:val="center"/>
-      </w:pPr>
-    </w:p>
-    <w:p>
-      <w:pPr>
-        <w:pStyle w:val="BodyA"/>
-        <w:spacing w:after="120"/>
-      </w:pPr>
-    </w:p>
-    <w:p>
-      <w:pPr>
-        <w:pStyle w:val="BodyA"/>
-        <w:spacing w:after="80" w:line="360" w:lineRule="auto"/>
-        <w:jc w:val="both"/>
-      </w:pPr>
-      <w:proofErr w:type="spellStart"/>
-      <w:r>
-        <w:rPr>
-          <w:b/>
-          <w:bCs/>
-          <w:sz w:val="26"/>
-          <w:szCs w:val="26"/>
-        </w:rPr>
-        <w:t>Белый</w:t>
-      </w:r>
-      <w:proofErr w:type="spellEnd"/>
-      <w:r>
-        <w:rPr>
-          <w:b/>
-          <w:bCs/>
-          <w:sz w:val="26"/>
-          <w:szCs w:val="26"/>
-        </w:rPr>
-        <w:t xml:space="preserve"> </w:t>
-      </w:r>
-      <w:proofErr w:type="spellStart"/>
-      <w:r>
-        <w:rPr>
-          <w:b/>
-          <w:bCs/>
-          <w:sz w:val="26"/>
-          <w:szCs w:val="26"/>
-        </w:rPr>
-        <w:t>ящик</w:t>
-      </w:r>
-      <w:proofErr w:type="spellEnd"/>
-      <w:r>
-        <w:rPr>
-          <w:b/>
-          <w:bCs/>
-          <w:sz w:val="26"/>
-          <w:szCs w:val="26"/>
-        </w:rPr>
-        <w:t>.</w:t>
-      </w:r>
-    </w:p>
-    <w:p>
-      <w:pPr>
-        <w:pStyle w:val="BodyA"/>
         <w:spacing w:after="120" w:line="360" w:lineRule="auto"/>
         <w:jc w:val="both"/>
         <w:rPr>
@@ -4393,317 +4136,8 @@
           <w:szCs w:val="26"/>
           <w:lang w:val="ru-RU"/>
         </w:rPr>
-        <w:t>Матрицы показывают, какие ветки и условия кода выполнялись в каждом тесте.</w:t>
-      </w:r>
-    </w:p>
-    <w:p>
-      <w:pPr>
-        <w:pStyle w:val="BodyA"/>
-        <w:spacing w:after="40" w:line="360" w:lineRule="auto"/>
-        <w:jc w:val="both"/>
-      </w:pPr>
-      <w:proofErr w:type="spellStart"/>
-      <w:r>
-        <w:rPr>
-          <w:b/>
-          <w:bCs/>
-          <w:sz w:val="26"/>
-          <w:szCs w:val="26"/>
-        </w:rPr>
-        <w:t>Задача</w:t>
-      </w:r>
-      <w:proofErr w:type="spellEnd"/>
-      <w:r>
-        <w:rPr>
-          <w:b/>
-          <w:bCs/>
-          <w:sz w:val="26"/>
-          <w:szCs w:val="26"/>
-        </w:rPr>
-        <w:t xml:space="preserve"> </w:t>
-      </w:r>
-      <w:r>
-        <w:rPr>
-          <w:b/>
-          <w:bCs/>
-          <w:sz w:val="26"/>
-          <w:szCs w:val="26"/>
-          <w:lang w:val="ru-RU"/>
-        </w:rPr>
-        <w:t>1:</w:t>
-      </w:r>
-    </w:p>
-    <w:p>
-      <w:pPr>
-        <w:jc w:val="center"/>
-      </w:pPr>
-      <w:r>
-        <w:drawing>
-          <wp:inline xmlns:a="http://schemas.openxmlformats.org/drawingml/2006/main" xmlns:pic="http://schemas.openxmlformats.org/drawingml/2006/picture">
-            <wp:extent cx="5940000" cy="964174"/>
-            <wp:docPr id="1073741835" name="Picture 1073741835"/>
-            <wp:cNvGraphicFramePr>
-              <a:graphicFrameLocks noChangeAspect="1"/>
-            </wp:cNvGraphicFramePr>
-            <a:graphic>
-              <a:graphicData uri="http://schemas.openxmlformats.org/drawingml/2006/picture">
-                <pic:pic>
-                  <pic:nvPicPr>
-                    <pic:cNvPr id="0" name="БЯ Задача 1.png"/>
-                    <pic:cNvPicPr/>
-                  </pic:nvPicPr>
-                  <pic:blipFill>
-                    <a:blip r:embed="rId20"/>
-                    <a:stretch>
-                      <a:fillRect/>
-                    </a:stretch>
-                  </pic:blipFill>
-                  <pic:spPr>
-                    <a:xfrm>
-                      <a:off x="0" y="0"/>
-                      <a:ext cx="5940000" cy="964174"/>
-                    </a:xfrm>
-                    <a:prstGeom prst="rect"/>
-                  </pic:spPr>
-                </pic:pic>
-              </a:graphicData>
-            </a:graphic>
-          </wp:inline>
-        </w:drawing>
-      </w:r>
-    </w:p>
-    <w:p>
-      <w:pPr>
-        <w:pStyle w:val="BodyA"/>
-        <w:widowControl w:val="0"/>
-        <w:spacing w:after="40"/>
-        <w:ind w:left="108" w:hanging="108"/>
-        <w:jc w:val="center"/>
-      </w:pPr>
-    </w:p>
-    <w:p>
-      <w:pPr>
-        <w:pStyle w:val="BodyA"/>
-        <w:widowControl w:val="0"/>
-        <w:spacing w:after="40"/>
-        <w:jc w:val="center"/>
-      </w:pPr>
-    </w:p>
-    <w:p>
-      <w:pPr>
-        <w:pStyle w:val="BodyA"/>
-        <w:spacing w:after="120"/>
-      </w:pPr>
-    </w:p>
-    <w:p>
-      <w:pPr>
-        <w:pStyle w:val="BodyA"/>
-        <w:spacing w:after="40" w:line="360" w:lineRule="auto"/>
-        <w:jc w:val="both"/>
-        <w:rPr>
-          <w:lang w:val="ru-RU"/>
-        </w:rPr>
-      </w:pPr>
-      <w:r>
-        <w:rPr>
-          <w:b/>
-          <w:bCs/>
-          <w:sz w:val="26"/>
-          <w:szCs w:val="26"/>
-          <w:lang w:val="ru-RU"/>
-        </w:rPr>
-        <w:t xml:space="preserve">Задача 2 (условия конъюнкции </w:t>
-      </w:r>
-      <w:r>
-        <w:rPr>
-          <w:b/>
-          <w:bCs/>
-          <w:sz w:val="26"/>
-          <w:szCs w:val="26"/>
-        </w:rPr>
-        <w:t>inside</w:t>
-      </w:r>
-      <w:r>
-        <w:rPr>
-          <w:b/>
-          <w:bCs/>
-          <w:sz w:val="26"/>
-          <w:szCs w:val="26"/>
-          <w:lang w:val="ru-RU"/>
-        </w:rPr>
-        <w:t xml:space="preserve"> = </w:t>
-      </w:r>
-      <w:r>
-        <w:rPr>
-          <w:b/>
-          <w:bCs/>
-          <w:sz w:val="26"/>
-          <w:szCs w:val="26"/>
-        </w:rPr>
-        <w:t>c</w:t>
-      </w:r>
-      <w:r>
-        <w:rPr>
-          <w:b/>
-          <w:bCs/>
-          <w:sz w:val="26"/>
-          <w:szCs w:val="26"/>
-          <w:lang w:val="ru-RU"/>
-        </w:rPr>
-        <w:t xml:space="preserve">1 &amp;&amp; </w:t>
-      </w:r>
-      <w:r>
-        <w:rPr>
-          <w:b/>
-          <w:bCs/>
-          <w:sz w:val="26"/>
-          <w:szCs w:val="26"/>
-        </w:rPr>
-        <w:t>c</w:t>
-      </w:r>
-      <w:r>
-        <w:rPr>
-          <w:b/>
-          <w:bCs/>
-          <w:sz w:val="26"/>
-          <w:szCs w:val="26"/>
-          <w:lang w:val="ru-RU"/>
-        </w:rPr>
-        <w:t xml:space="preserve">2 &amp;&amp; </w:t>
-      </w:r>
-      <w:r>
-        <w:rPr>
-          <w:b/>
-          <w:bCs/>
-          <w:sz w:val="26"/>
-          <w:szCs w:val="26"/>
-        </w:rPr>
-        <w:t>c</w:t>
-      </w:r>
-      <w:r>
-        <w:rPr>
-          <w:b/>
-          <w:bCs/>
-          <w:sz w:val="26"/>
-          <w:szCs w:val="26"/>
-          <w:lang w:val="ru-RU"/>
-        </w:rPr>
-        <w:t xml:space="preserve">3 &amp;&amp; </w:t>
-      </w:r>
-      <w:r>
-        <w:rPr>
-          <w:b/>
-          <w:bCs/>
-          <w:sz w:val="26"/>
-          <w:szCs w:val="26"/>
-        </w:rPr>
-        <w:t>c</w:t>
-      </w:r>
-      <w:r>
-        <w:rPr>
-          <w:b/>
-          <w:bCs/>
-          <w:sz w:val="26"/>
-          <w:szCs w:val="26"/>
-          <w:lang w:val="ru-RU"/>
-        </w:rPr>
-        <w:t>4):</w:t>
-      </w:r>
-    </w:p>
-    <w:p>
-      <w:pPr>
-        <w:jc w:val="center"/>
-      </w:pPr>
-      <w:r>
-        <w:drawing>
-          <wp:inline xmlns:a="http://schemas.openxmlformats.org/drawingml/2006/main" xmlns:pic="http://schemas.openxmlformats.org/drawingml/2006/picture">
-            <wp:extent cx="5940000" cy="2454085"/>
-            <wp:docPr id="1073741836" name="Picture 1073741836"/>
-            <wp:cNvGraphicFramePr>
-              <a:graphicFrameLocks noChangeAspect="1"/>
-            </wp:cNvGraphicFramePr>
-            <a:graphic>
-              <a:graphicData uri="http://schemas.openxmlformats.org/drawingml/2006/picture">
-                <pic:pic>
-                  <pic:nvPicPr>
-                    <pic:cNvPr id="0" name="БЯ Задача 2.png"/>
-                    <pic:cNvPicPr/>
-                  </pic:nvPicPr>
-                  <pic:blipFill>
-                    <a:blip r:embed="rId21"/>
-                    <a:stretch>
-                      <a:fillRect/>
-                    </a:stretch>
-                  </pic:blipFill>
-                  <pic:spPr>
-                    <a:xfrm>
-                      <a:off x="0" y="0"/>
-                      <a:ext cx="5940000" cy="2454085"/>
-                    </a:xfrm>
-                    <a:prstGeom prst="rect"/>
-                  </pic:spPr>
-                </pic:pic>
-              </a:graphicData>
-            </a:graphic>
-          </wp:inline>
-        </w:drawing>
-      </w:r>
-    </w:p>
-    <w:p>
-      <w:pPr>
-        <w:pStyle w:val="BodyA"/>
-        <w:widowControl w:val="0"/>
-        <w:spacing w:after="40"/>
-        <w:ind w:left="108" w:hanging="108"/>
-        <w:jc w:val="center"/>
-      </w:pPr>
-    </w:p>
-    <w:p>
-      <w:pPr>
-        <w:pStyle w:val="BodyA"/>
-        <w:widowControl w:val="0"/>
-        <w:spacing w:after="40"/>
-        <w:jc w:val="center"/>
-      </w:pPr>
-    </w:p>
-    <w:p>
-      <w:pPr>
-        <w:pStyle w:val="BodyA"/>
-        <w:spacing w:after="120"/>
-      </w:pPr>
-    </w:p>
-    <w:p>
-      <w:pPr>
-        <w:pStyle w:val="BodyA"/>
-        <w:spacing w:after="120" w:line="360" w:lineRule="auto"/>
-        <w:jc w:val="both"/>
-        <w:rPr>
-          <w:lang w:val="ru-RU"/>
-        </w:rPr>
-      </w:pPr>
-      <w:r>
-        <w:rPr>
-          <w:sz w:val="26"/>
-          <w:szCs w:val="26"/>
-          <w:lang w:val="ru-RU"/>
-        </w:rPr>
-        <w:t xml:space="preserve">Задача </w:t>
-      </w:r>
-      <w:r>
-        <w:rPr>
-          <w:sz w:val="26"/>
-          <w:szCs w:val="26"/>
-          <w:lang w:val="ru-RU"/>
-        </w:rPr>
-        <w:t xml:space="preserve">3: </w:t>
-      </w:r>
-      <w:r>
-        <w:rPr>
-          <w:sz w:val="26"/>
-          <w:szCs w:val="26"/>
-          <w:lang w:val="ru-RU"/>
-        </w:rPr>
-        <w:t xml:space="preserve">ветвлений в коде нет, поэтому матрица не требуется — тест </w:t>
+        <w:lastRenderedPageBreak/>
+        <w:t xml:space="preserve">Задача 3: ветвлений в коде нет, поэтому матрица не требуется — тест </w:t>
       </w:r>
       <w:r>
         <w:rPr>
@@ -4801,23 +4235,7 @@
           <w:szCs w:val="26"/>
           <w:lang w:val="ru-RU"/>
         </w:rPr>
-        <w:t>#, решающее три задачи варианта 22: вычисление выражений с пре</w:t>
-      </w:r>
-      <w:r>
-        <w:rPr>
-          <w:sz w:val="26"/>
-          <w:szCs w:val="26"/>
-          <w:lang w:val="ru-RU"/>
-        </w:rPr>
-        <w:t xml:space="preserve">- </w:t>
-      </w:r>
-      <w:r>
-        <w:rPr>
-          <w:sz w:val="26"/>
-          <w:szCs w:val="26"/>
-          <w:lang w:val="ru-RU"/>
-        </w:rPr>
-        <w:t xml:space="preserve">и постфиксными операциями инкремента/декремента и функциями из класса </w:t>
+        <w:t xml:space="preserve">#, решающее три задачи варианта 22: вычисление выражений с пре- и постфиксными операциями инкремента/декремента и функциями из класса </w:t>
       </w:r>
       <w:r>
         <w:rPr>
@@ -4832,16 +4250,7 @@
           <w:szCs w:val="26"/>
           <w:lang w:val="ru-RU"/>
         </w:rPr>
-        <w:t xml:space="preserve"> с проверкой области допустимых значений; проверку принадлежности точки </w:t>
-      </w:r>
-      <w:r>
-        <w:rPr>
-          <w:sz w:val="26"/>
-          <w:szCs w:val="26"/>
-          <w:lang w:val="ru-RU"/>
-        </w:rPr>
-        <w:lastRenderedPageBreak/>
-        <w:t xml:space="preserve">заданной геометрической области с помощью системы линейных неравенств; сравнение точности представления вещественных чисел в типах </w:t>
+        <w:t xml:space="preserve"> с проверкой области допустимых значений; проверку принадлежности точки заданной геометрической области с помощью системы линейных неравенств; сравнение точности представления вещественных чисел в типах </w:t>
       </w:r>
       <w:r>
         <w:rPr>
@@ -4889,23 +4298,7 @@
           <w:szCs w:val="26"/>
           <w:lang w:val="ru-RU"/>
         </w:rPr>
-        <w:t xml:space="preserve">Составленная система из 19 тестов охватывает основные классы входных данных, граничные значения и все достижимые ветви условных операторов программы. По критериям чёрного ящика проверены положительные, нулевые и отрицательные значения, граничные случаи, а также точки внутри, на границе и вне заданной области — в том числе с нарушением ровно одного из четырёх условий по отдельности. По критериям белого ящика покрыты обе ветви условного оператора в задаче </w:t>
-      </w:r>
-      <w:r>
-        <w:rPr>
-          <w:sz w:val="26"/>
-          <w:szCs w:val="26"/>
-          <w:lang w:val="ru-RU"/>
-        </w:rPr>
-        <w:t xml:space="preserve">1 </w:t>
-      </w:r>
-      <w:r>
-        <w:rPr>
-          <w:sz w:val="26"/>
-          <w:szCs w:val="26"/>
-          <w:lang w:val="ru-RU"/>
-        </w:rPr>
-        <w:t>и оба возможных результата конъюнкции в задаче 2. Это подтверждает корректность работы программы.</w:t>
+        <w:t xml:space="preserve">Составленная система из 19 тестов охватывает основные классы входных данных, граничные значения и все достижимые ветви условных операторов программы. По критериям чёрного ящика проверены положительные, нулевые и отрицательные значения, граничные случаи, а также точки внутри, на границе и вне заданной области — в том числе с нарушением ровно одного из четырёх условий по отдельности. По критериям белого ящика покрыты обе ветви условного оператора в задаче 1 и оба возможных результата конъюнкции в задаче 2. Это подтверждает корректность работы программы.</w:t>
       </w:r>
     </w:p>
     <w:p>
@@ -4923,7 +4316,7 @@
           <w:szCs w:val="26"/>
           <w:lang w:val="ru-RU"/>
         </w:rPr>
-        <w:t xml:space="preserve">Сравнение результатов задачи 3 показывает, что </w:t>
+        <w:t xml:space="preserve">Сравнение результатов задачи 3 показывает эффект катастрофического сокращения: выражение ((a−b)³−a³)/(3ab²−b³−3a²b) при любых a и b аналитически тождественно равно 1, но и числитель, и знаменатель вычисляются как разность близких по величине слагаемых порядка a³ (при a=1000 это величина порядка 10⁹), тогда как сама разность на несколько порядков меньше. Тип </w:t>
       </w:r>
       <w:r>
         <w:rPr>
@@ -4938,38 +4331,7 @@
           <w:szCs w:val="26"/>
           <w:lang w:val="ru-RU"/>
         </w:rPr>
-        <w:t xml:space="preserve"> (≈</w:t>
-      </w:r>
-      <w:r>
-        <w:rPr>
-          <w:sz w:val="26"/>
-          <w:szCs w:val="26"/>
-          <w:lang w:val="ru-RU"/>
-        </w:rPr>
-        <w:t xml:space="preserve">7 </w:t>
-      </w:r>
-      <w:r>
-        <w:rPr>
-          <w:sz w:val="26"/>
-          <w:szCs w:val="26"/>
-          <w:lang w:val="ru-RU"/>
-        </w:rPr>
-        <w:t xml:space="preserve">значащих цифр) недостаточно точен для числа 1000.0001, которое требует 8 значащих цифр, поэтому результат в </w:t>
-      </w:r>
-      <w:r>
-        <w:rPr>
-          <w:sz w:val="26"/>
-          <w:szCs w:val="26"/>
-        </w:rPr>
-        <w:t>float</w:t>
-      </w:r>
-      <w:r>
-        <w:rPr>
-          <w:sz w:val="26"/>
-          <w:szCs w:val="26"/>
-          <w:lang w:val="ru-RU"/>
-        </w:rPr>
-        <w:t xml:space="preserve"> заметно отличается от аналитического значения (1000000.20000001), тогда как </w:t>
+        <w:t xml:space="preserve"> (≈7 значащих цифр) теряет значащие цифры при таком вычитании, из-за чего результат получается ≈1.28 — отклонение от точного значения 1 составляет около 28%. Тип </w:t>
       </w:r>
       <w:r>
         <w:rPr>
@@ -4984,12 +4346,12 @@
           <w:szCs w:val="26"/>
           <w:lang w:val="ru-RU"/>
         </w:rPr>
-        <w:t xml:space="preserve"> (≈15–16 значащих цифр) сохраняет точность практически без потерь.</w:t>
+        <w:t xml:space="preserve"> (≈15–16 значащих цифр) сохраняет точность практически без потерь: результат ≈0.9999999999, отклонение от 1 — порядка 10⁻¹⁰.</w:t>
       </w:r>
     </w:p>
     <w:sectPr>
-      <w:headerReference w:type="default" r:id="rId10"/>
-      <w:footerReference w:type="default" r:id="rId11"/>
+      <w:headerReference w:type="default" r:id="rId18"/>
+      <w:footerReference w:type="default" r:id="rId19"/>
       <w:pgSz w:w="11900" w:h="16840"/>
       <w:pgMar w:top="1134" w:right="850" w:bottom="1134" w:left="1701" w:header="720" w:footer="720" w:gutter="0"/>
       <w:cols w:space="720"/>

</xml_diff>